<commit_message>
Fix table hyperlink width and line-wrapping in submission documents
</commit_message>
<xml_diff>
--- a/SohamPawar_230905312_BT_Assignment2.docx
+++ b/SohamPawar_230905312_BT_Assignment2.docx
@@ -37,7 +37,7 @@
         <w:rPr>
           <w:color w:val="CBD5E1"/>
         </w:rPr>
-        <w:t>―――――――――――――――――――――――――――――――――――――――――――――――――――――――</w:t>
+        <w:t>―――――――――――――――――――――――――――――――――――――――――――――――――――――――――――――――――</w:t>
       </w:r>
     </w:p>
     <w:tbl>
@@ -48,19 +48,19 @@
         <w:tblLook w:firstColumn="1" w:firstRow="1" w:lastColumn="0" w:lastRow="0" w:noHBand="0" w:noVBand="1" w:val="04A0"/>
       </w:tblPr>
       <w:tblGrid>
-        <w:gridCol w:w="4968"/>
-        <w:gridCol w:w="4968"/>
+        <w:gridCol w:w="5184"/>
+        <w:gridCol w:w="5184"/>
       </w:tblGrid>
       <w:tr>
         <w:tc>
           <w:tcPr>
-            <w:tcW w:type="dxa" w:w="3312"/>
+            <w:tcW w:type="dxa" w:w="2880"/>
             <w:shd w:fill="F1F5F9"/>
             <w:tcMar>
-              <w:top w:w="80" w:type="dxa"/>
-              <w:bottom w:w="80" w:type="dxa"/>
-              <w:left w:w="120" w:type="dxa"/>
-              <w:right w:w="120" w:type="dxa"/>
+              <w:top w:w="70" w:type="dxa"/>
+              <w:bottom w:w="70" w:type="dxa"/>
+              <w:left w:w="100" w:type="dxa"/>
+              <w:right w:w="100" w:type="dxa"/>
             </w:tcMar>
           </w:tcPr>
           <w:p>
@@ -72,7 +72,7 @@
                 <w:rFonts w:ascii="Calibri" w:hAnsi="Calibri"/>
                 <w:b/>
                 <w:color w:val="1E293B"/>
-                <w:sz w:val="22"/>
+                <w:sz w:val="20"/>
               </w:rPr>
               <w:t>Student Name:</w:t>
             </w:r>
@@ -80,13 +80,13 @@
         </w:tc>
         <w:tc>
           <w:tcPr>
-            <w:tcW w:type="dxa" w:w="6480"/>
+            <w:tcW w:type="dxa" w:w="7488"/>
             <w:shd w:fill="FFFFFF"/>
             <w:tcMar>
-              <w:top w:w="80" w:type="dxa"/>
-              <w:bottom w:w="80" w:type="dxa"/>
-              <w:left w:w="120" w:type="dxa"/>
-              <w:right w:w="120" w:type="dxa"/>
+              <w:top w:w="70" w:type="dxa"/>
+              <w:bottom w:w="70" w:type="dxa"/>
+              <w:left w:w="100" w:type="dxa"/>
+              <w:right w:w="100" w:type="dxa"/>
             </w:tcMar>
           </w:tcPr>
           <w:p>
@@ -95,7 +95,7 @@
                 <w:rFonts w:ascii="Calibri" w:hAnsi="Calibri"/>
                 <w:b/>
                 <w:color w:val="0F172A"/>
-                <w:sz w:val="22"/>
+                <w:sz w:val="20"/>
               </w:rPr>
               <w:t>Soham Sandeep Pawar</w:t>
             </w:r>
@@ -105,13 +105,13 @@
       <w:tr>
         <w:tc>
           <w:tcPr>
-            <w:tcW w:type="dxa" w:w="3312"/>
+            <w:tcW w:type="dxa" w:w="2880"/>
             <w:shd w:fill="F1F5F9"/>
             <w:tcMar>
-              <w:top w:w="80" w:type="dxa"/>
-              <w:bottom w:w="80" w:type="dxa"/>
-              <w:left w:w="120" w:type="dxa"/>
-              <w:right w:w="120" w:type="dxa"/>
+              <w:top w:w="70" w:type="dxa"/>
+              <w:bottom w:w="70" w:type="dxa"/>
+              <w:left w:w="100" w:type="dxa"/>
+              <w:right w:w="100" w:type="dxa"/>
             </w:tcMar>
           </w:tcPr>
           <w:p>
@@ -123,7 +123,7 @@
                 <w:rFonts w:ascii="Calibri" w:hAnsi="Calibri"/>
                 <w:b/>
                 <w:color w:val="1E293B"/>
-                <w:sz w:val="22"/>
+                <w:sz w:val="20"/>
               </w:rPr>
               <w:t>Registration Number:</w:t>
             </w:r>
@@ -131,13 +131,13 @@
         </w:tc>
         <w:tc>
           <w:tcPr>
-            <w:tcW w:type="dxa" w:w="6480"/>
+            <w:tcW w:type="dxa" w:w="7488"/>
             <w:shd w:fill="FFFFFF"/>
             <w:tcMar>
-              <w:top w:w="80" w:type="dxa"/>
-              <w:bottom w:w="80" w:type="dxa"/>
-              <w:left w:w="120" w:type="dxa"/>
-              <w:right w:w="120" w:type="dxa"/>
+              <w:top w:w="70" w:type="dxa"/>
+              <w:bottom w:w="70" w:type="dxa"/>
+              <w:left w:w="100" w:type="dxa"/>
+              <w:right w:w="100" w:type="dxa"/>
             </w:tcMar>
           </w:tcPr>
           <w:p>
@@ -146,7 +146,7 @@
                 <w:rFonts w:ascii="Calibri" w:hAnsi="Calibri"/>
                 <w:b/>
                 <w:color w:val="0F172A"/>
-                <w:sz w:val="22"/>
+                <w:sz w:val="20"/>
               </w:rPr>
               <w:t>230905312</w:t>
             </w:r>
@@ -156,13 +156,13 @@
       <w:tr>
         <w:tc>
           <w:tcPr>
-            <w:tcW w:type="dxa" w:w="3312"/>
+            <w:tcW w:type="dxa" w:w="2880"/>
             <w:shd w:fill="F1F5F9"/>
             <w:tcMar>
-              <w:top w:w="80" w:type="dxa"/>
-              <w:bottom w:w="80" w:type="dxa"/>
-              <w:left w:w="120" w:type="dxa"/>
-              <w:right w:w="120" w:type="dxa"/>
+              <w:top w:w="70" w:type="dxa"/>
+              <w:bottom w:w="70" w:type="dxa"/>
+              <w:left w:w="100" w:type="dxa"/>
+              <w:right w:w="100" w:type="dxa"/>
             </w:tcMar>
           </w:tcPr>
           <w:p>
@@ -174,7 +174,7 @@
                 <w:rFonts w:ascii="Calibri" w:hAnsi="Calibri"/>
                 <w:b/>
                 <w:color w:val="1E293B"/>
-                <w:sz w:val="22"/>
+                <w:sz w:val="20"/>
               </w:rPr>
               <w:t>Assignment Title:</w:t>
             </w:r>
@@ -182,13 +182,13 @@
         </w:tc>
         <w:tc>
           <w:tcPr>
-            <w:tcW w:type="dxa" w:w="6480"/>
+            <w:tcW w:type="dxa" w:w="7488"/>
             <w:shd w:fill="FFFFFF"/>
             <w:tcMar>
-              <w:top w:w="80" w:type="dxa"/>
-              <w:bottom w:w="80" w:type="dxa"/>
-              <w:left w:w="120" w:type="dxa"/>
-              <w:right w:w="120" w:type="dxa"/>
+              <w:top w:w="70" w:type="dxa"/>
+              <w:bottom w:w="70" w:type="dxa"/>
+              <w:left w:w="100" w:type="dxa"/>
+              <w:right w:w="100" w:type="dxa"/>
             </w:tcMar>
           </w:tcPr>
           <w:p>
@@ -196,7 +196,7 @@
               <w:rPr>
                 <w:rFonts w:ascii="Calibri" w:hAnsi="Calibri"/>
                 <w:color w:val="334155"/>
-                <w:sz w:val="22"/>
+                <w:sz w:val="20"/>
               </w:rPr>
               <w:t>Design and Development of an Original DApp (Assignment 2)</w:t>
             </w:r>
@@ -206,13 +206,13 @@
       <w:tr>
         <w:tc>
           <w:tcPr>
-            <w:tcW w:type="dxa" w:w="3312"/>
+            <w:tcW w:type="dxa" w:w="2880"/>
             <w:shd w:fill="F1F5F9"/>
             <w:tcMar>
-              <w:top w:w="80" w:type="dxa"/>
-              <w:bottom w:w="80" w:type="dxa"/>
-              <w:left w:w="120" w:type="dxa"/>
-              <w:right w:w="120" w:type="dxa"/>
+              <w:top w:w="70" w:type="dxa"/>
+              <w:bottom w:w="70" w:type="dxa"/>
+              <w:left w:w="100" w:type="dxa"/>
+              <w:right w:w="100" w:type="dxa"/>
             </w:tcMar>
           </w:tcPr>
           <w:p>
@@ -224,7 +224,7 @@
                 <w:rFonts w:ascii="Calibri" w:hAnsi="Calibri"/>
                 <w:b/>
                 <w:color w:val="1E293B"/>
-                <w:sz w:val="22"/>
+                <w:sz w:val="20"/>
               </w:rPr>
               <w:t>Title of Developed DApp:</w:t>
             </w:r>
@@ -232,13 +232,13 @@
         </w:tc>
         <w:tc>
           <w:tcPr>
-            <w:tcW w:type="dxa" w:w="6480"/>
+            <w:tcW w:type="dxa" w:w="7488"/>
             <w:shd w:fill="FFFFFF"/>
             <w:tcMar>
-              <w:top w:w="80" w:type="dxa"/>
-              <w:bottom w:w="80" w:type="dxa"/>
-              <w:left w:w="120" w:type="dxa"/>
-              <w:right w:w="120" w:type="dxa"/>
+              <w:top w:w="70" w:type="dxa"/>
+              <w:bottom w:w="70" w:type="dxa"/>
+              <w:left w:w="100" w:type="dxa"/>
+              <w:right w:w="100" w:type="dxa"/>
             </w:tcMar>
           </w:tcPr>
           <w:p>
@@ -247,7 +247,7 @@
                 <w:rFonts w:ascii="Calibri" w:hAnsi="Calibri"/>
                 <w:b/>
                 <w:color w:val="0F172A"/>
-                <w:sz w:val="22"/>
+                <w:sz w:val="20"/>
               </w:rPr>
               <w:t>Decentralized Academic Credential Verification System (EduVerify)</w:t>
             </w:r>
@@ -257,13 +257,13 @@
       <w:tr>
         <w:tc>
           <w:tcPr>
-            <w:tcW w:type="dxa" w:w="3312"/>
+            <w:tcW w:type="dxa" w:w="2880"/>
             <w:shd w:fill="F1F5F9"/>
             <w:tcMar>
-              <w:top w:w="80" w:type="dxa"/>
-              <w:bottom w:w="80" w:type="dxa"/>
-              <w:left w:w="120" w:type="dxa"/>
-              <w:right w:w="120" w:type="dxa"/>
+              <w:top w:w="70" w:type="dxa"/>
+              <w:bottom w:w="70" w:type="dxa"/>
+              <w:left w:w="100" w:type="dxa"/>
+              <w:right w:w="100" w:type="dxa"/>
             </w:tcMar>
           </w:tcPr>
           <w:p>
@@ -275,7 +275,7 @@
                 <w:rFonts w:ascii="Calibri" w:hAnsi="Calibri"/>
                 <w:b/>
                 <w:color w:val="1E293B"/>
-                <w:sz w:val="22"/>
+                <w:sz w:val="20"/>
               </w:rPr>
               <w:t>GitHub Repository Link:</w:t>
             </w:r>
@@ -283,26 +283,26 @@
         </w:tc>
         <w:tc>
           <w:tcPr>
-            <w:tcW w:type="dxa" w:w="6480"/>
+            <w:tcW w:type="dxa" w:w="7488"/>
             <w:shd w:fill="FFFFFF"/>
             <w:tcMar>
-              <w:top w:w="80" w:type="dxa"/>
-              <w:bottom w:w="80" w:type="dxa"/>
-              <w:left w:w="120" w:type="dxa"/>
-              <w:right w:w="120" w:type="dxa"/>
+              <w:top w:w="70" w:type="dxa"/>
+              <w:bottom w:w="70" w:type="dxa"/>
+              <w:left w:w="100" w:type="dxa"/>
+              <w:right w:w="100" w:type="dxa"/>
             </w:tcMar>
           </w:tcPr>
           <w:p>
-            <w:r>
-              <w:rPr>
-                <w:rFonts w:ascii="Calibri" w:hAnsi="Calibri"/>
-                <w:b/>
-                <w:color w:val="2563EB"/>
-                <w:sz w:val="22"/>
-                <w:u w:val="single"/>
-              </w:rPr>
-              <w:t>https://github.com/soh4mpawar/academic-credential-verification-dapp</w:t>
-            </w:r>
+            <w:hyperlink r:id="rId9">
+              <w:r>
+                <w:rPr>
+                  <w:color w:val="2563EB"/>
+                  <w:u w:val="single"/>
+                  <w:rFonts w:ascii="Calibri" w:hAnsi="Calibri"/>
+                </w:rPr>
+                <w:t>https://github.com/soh4mpawar/academic-credential-verification-dapp</w:t>
+              </w:r>
+            </w:hyperlink>
           </w:p>
         </w:tc>
       </w:tr>
@@ -363,16 +363,16 @@
         <w:tblLook w:firstColumn="1" w:firstRow="1" w:lastColumn="0" w:lastRow="0" w:noHBand="0" w:noVBand="1" w:val="04A0"/>
       </w:tblPr>
       <w:tblGrid>
-        <w:gridCol w:w="1987"/>
-        <w:gridCol w:w="1987"/>
-        <w:gridCol w:w="1987"/>
-        <w:gridCol w:w="1987"/>
-        <w:gridCol w:w="1987"/>
+        <w:gridCol w:w="2074"/>
+        <w:gridCol w:w="2074"/>
+        <w:gridCol w:w="2074"/>
+        <w:gridCol w:w="2074"/>
+        <w:gridCol w:w="2074"/>
       </w:tblGrid>
       <w:tr>
         <w:tc>
           <w:tcPr>
-            <w:tcW w:type="dxa" w:w="1987"/>
+            <w:tcW w:type="dxa" w:w="2074"/>
             <w:shd w:fill="1E293B"/>
             <w:tcMar>
               <w:top w:w="60" w:type="dxa"/>
@@ -395,7 +395,7 @@
         </w:tc>
         <w:tc>
           <w:tcPr>
-            <w:tcW w:type="dxa" w:w="1987"/>
+            <w:tcW w:type="dxa" w:w="2074"/>
             <w:shd w:fill="1E293B"/>
             <w:tcMar>
               <w:top w:w="60" w:type="dxa"/>
@@ -418,7 +418,7 @@
         </w:tc>
         <w:tc>
           <w:tcPr>
-            <w:tcW w:type="dxa" w:w="1987"/>
+            <w:tcW w:type="dxa" w:w="2074"/>
             <w:shd w:fill="1E293B"/>
             <w:tcMar>
               <w:top w:w="60" w:type="dxa"/>
@@ -441,7 +441,7 @@
         </w:tc>
         <w:tc>
           <w:tcPr>
-            <w:tcW w:type="dxa" w:w="1987"/>
+            <w:tcW w:type="dxa" w:w="2074"/>
             <w:shd w:fill="1E293B"/>
             <w:tcMar>
               <w:top w:w="60" w:type="dxa"/>
@@ -464,7 +464,7 @@
         </w:tc>
         <w:tc>
           <w:tcPr>
-            <w:tcW w:type="dxa" w:w="1987"/>
+            <w:tcW w:type="dxa" w:w="2074"/>
             <w:shd w:fill="1E293B"/>
             <w:tcMar>
               <w:top w:w="60" w:type="dxa"/>
@@ -489,7 +489,7 @@
       <w:tr>
         <w:tc>
           <w:tcPr>
-            <w:tcW w:type="dxa" w:w="1987"/>
+            <w:tcW w:type="dxa" w:w="2074"/>
             <w:shd w:fill="F8FAFC"/>
             <w:tcMar>
               <w:top w:w="50" w:type="dxa"/>
@@ -511,7 +511,7 @@
         </w:tc>
         <w:tc>
           <w:tcPr>
-            <w:tcW w:type="dxa" w:w="1987"/>
+            <w:tcW w:type="dxa" w:w="2074"/>
             <w:shd w:fill="F8FAFC"/>
             <w:tcMar>
               <w:top w:w="50" w:type="dxa"/>
@@ -533,7 +533,7 @@
         </w:tc>
         <w:tc>
           <w:tcPr>
-            <w:tcW w:type="dxa" w:w="1987"/>
+            <w:tcW w:type="dxa" w:w="2074"/>
             <w:shd w:fill="F8FAFC"/>
             <w:tcMar>
               <w:top w:w="50" w:type="dxa"/>
@@ -555,7 +555,7 @@
         </w:tc>
         <w:tc>
           <w:tcPr>
-            <w:tcW w:type="dxa" w:w="1987"/>
+            <w:tcW w:type="dxa" w:w="2074"/>
             <w:shd w:fill="F8FAFC"/>
             <w:tcMar>
               <w:top w:w="50" w:type="dxa"/>
@@ -577,7 +577,7 @@
         </w:tc>
         <w:tc>
           <w:tcPr>
-            <w:tcW w:type="dxa" w:w="1987"/>
+            <w:tcW w:type="dxa" w:w="2074"/>
             <w:shd w:fill="F8FAFC"/>
             <w:tcMar>
               <w:top w:w="50" w:type="dxa"/>
@@ -602,7 +602,7 @@
       <w:tr>
         <w:tc>
           <w:tcPr>
-            <w:tcW w:type="dxa" w:w="1987"/>
+            <w:tcW w:type="dxa" w:w="2074"/>
             <w:shd w:fill="FFFFFF"/>
             <w:tcMar>
               <w:top w:w="50" w:type="dxa"/>
@@ -624,7 +624,7 @@
         </w:tc>
         <w:tc>
           <w:tcPr>
-            <w:tcW w:type="dxa" w:w="1987"/>
+            <w:tcW w:type="dxa" w:w="2074"/>
             <w:shd w:fill="FFFFFF"/>
             <w:tcMar>
               <w:top w:w="50" w:type="dxa"/>
@@ -646,7 +646,7 @@
         </w:tc>
         <w:tc>
           <w:tcPr>
-            <w:tcW w:type="dxa" w:w="1987"/>
+            <w:tcW w:type="dxa" w:w="2074"/>
             <w:shd w:fill="FFFFFF"/>
             <w:tcMar>
               <w:top w:w="50" w:type="dxa"/>
@@ -668,7 +668,7 @@
         </w:tc>
         <w:tc>
           <w:tcPr>
-            <w:tcW w:type="dxa" w:w="1987"/>
+            <w:tcW w:type="dxa" w:w="2074"/>
             <w:shd w:fill="FFFFFF"/>
             <w:tcMar>
               <w:top w:w="50" w:type="dxa"/>
@@ -690,7 +690,7 @@
         </w:tc>
         <w:tc>
           <w:tcPr>
-            <w:tcW w:type="dxa" w:w="1987"/>
+            <w:tcW w:type="dxa" w:w="2074"/>
             <w:shd w:fill="FFFFFF"/>
             <w:tcMar>
               <w:top w:w="50" w:type="dxa"/>
@@ -715,7 +715,7 @@
       <w:tr>
         <w:tc>
           <w:tcPr>
-            <w:tcW w:type="dxa" w:w="1987"/>
+            <w:tcW w:type="dxa" w:w="2074"/>
             <w:shd w:fill="F8FAFC"/>
             <w:tcMar>
               <w:top w:w="50" w:type="dxa"/>
@@ -737,7 +737,7 @@
         </w:tc>
         <w:tc>
           <w:tcPr>
-            <w:tcW w:type="dxa" w:w="1987"/>
+            <w:tcW w:type="dxa" w:w="2074"/>
             <w:shd w:fill="F8FAFC"/>
             <w:tcMar>
               <w:top w:w="50" w:type="dxa"/>
@@ -759,7 +759,7 @@
         </w:tc>
         <w:tc>
           <w:tcPr>
-            <w:tcW w:type="dxa" w:w="1987"/>
+            <w:tcW w:type="dxa" w:w="2074"/>
             <w:shd w:fill="F8FAFC"/>
             <w:tcMar>
               <w:top w:w="50" w:type="dxa"/>
@@ -781,7 +781,7 @@
         </w:tc>
         <w:tc>
           <w:tcPr>
-            <w:tcW w:type="dxa" w:w="1987"/>
+            <w:tcW w:type="dxa" w:w="2074"/>
             <w:shd w:fill="F8FAFC"/>
             <w:tcMar>
               <w:top w:w="50" w:type="dxa"/>
@@ -803,7 +803,7 @@
         </w:tc>
         <w:tc>
           <w:tcPr>
-            <w:tcW w:type="dxa" w:w="1987"/>
+            <w:tcW w:type="dxa" w:w="2074"/>
             <w:shd w:fill="F8FAFC"/>
             <w:tcMar>
               <w:top w:w="50" w:type="dxa"/>
@@ -828,7 +828,7 @@
       <w:tr>
         <w:tc>
           <w:tcPr>
-            <w:tcW w:type="dxa" w:w="1987"/>
+            <w:tcW w:type="dxa" w:w="2074"/>
             <w:shd w:fill="FFFFFF"/>
             <w:tcMar>
               <w:top w:w="50" w:type="dxa"/>
@@ -850,7 +850,7 @@
         </w:tc>
         <w:tc>
           <w:tcPr>
-            <w:tcW w:type="dxa" w:w="1987"/>
+            <w:tcW w:type="dxa" w:w="2074"/>
             <w:shd w:fill="FFFFFF"/>
             <w:tcMar>
               <w:top w:w="50" w:type="dxa"/>
@@ -872,7 +872,7 @@
         </w:tc>
         <w:tc>
           <w:tcPr>
-            <w:tcW w:type="dxa" w:w="1987"/>
+            <w:tcW w:type="dxa" w:w="2074"/>
             <w:shd w:fill="FFFFFF"/>
             <w:tcMar>
               <w:top w:w="50" w:type="dxa"/>
@@ -894,7 +894,7 @@
         </w:tc>
         <w:tc>
           <w:tcPr>
-            <w:tcW w:type="dxa" w:w="1987"/>
+            <w:tcW w:type="dxa" w:w="2074"/>
             <w:shd w:fill="FFFFFF"/>
             <w:tcMar>
               <w:top w:w="50" w:type="dxa"/>
@@ -916,7 +916,7 @@
         </w:tc>
         <w:tc>
           <w:tcPr>
-            <w:tcW w:type="dxa" w:w="1987"/>
+            <w:tcW w:type="dxa" w:w="2074"/>
             <w:shd w:fill="FFFFFF"/>
             <w:tcMar>
               <w:top w:w="50" w:type="dxa"/>
@@ -941,7 +941,7 @@
       <w:tr>
         <w:tc>
           <w:tcPr>
-            <w:tcW w:type="dxa" w:w="1987"/>
+            <w:tcW w:type="dxa" w:w="2074"/>
             <w:shd w:fill="F8FAFC"/>
             <w:tcMar>
               <w:top w:w="50" w:type="dxa"/>
@@ -963,7 +963,7 @@
         </w:tc>
         <w:tc>
           <w:tcPr>
-            <w:tcW w:type="dxa" w:w="1987"/>
+            <w:tcW w:type="dxa" w:w="2074"/>
             <w:shd w:fill="F8FAFC"/>
             <w:tcMar>
               <w:top w:w="50" w:type="dxa"/>
@@ -985,7 +985,7 @@
         </w:tc>
         <w:tc>
           <w:tcPr>
-            <w:tcW w:type="dxa" w:w="1987"/>
+            <w:tcW w:type="dxa" w:w="2074"/>
             <w:shd w:fill="F8FAFC"/>
             <w:tcMar>
               <w:top w:w="50" w:type="dxa"/>
@@ -1007,7 +1007,7 @@
         </w:tc>
         <w:tc>
           <w:tcPr>
-            <w:tcW w:type="dxa" w:w="1987"/>
+            <w:tcW w:type="dxa" w:w="2074"/>
             <w:shd w:fill="F8FAFC"/>
             <w:tcMar>
               <w:top w:w="50" w:type="dxa"/>
@@ -1029,7 +1029,7 @@
         </w:tc>
         <w:tc>
           <w:tcPr>
-            <w:tcW w:type="dxa" w:w="1987"/>
+            <w:tcW w:type="dxa" w:w="2074"/>
             <w:shd w:fill="F8FAFC"/>
             <w:tcMar>
               <w:top w:w="50" w:type="dxa"/>
@@ -1054,7 +1054,7 @@
       <w:tr>
         <w:tc>
           <w:tcPr>
-            <w:tcW w:type="dxa" w:w="1987"/>
+            <w:tcW w:type="dxa" w:w="2074"/>
             <w:shd w:fill="FFFFFF"/>
             <w:tcMar>
               <w:top w:w="50" w:type="dxa"/>
@@ -1076,7 +1076,7 @@
         </w:tc>
         <w:tc>
           <w:tcPr>
-            <w:tcW w:type="dxa" w:w="1987"/>
+            <w:tcW w:type="dxa" w:w="2074"/>
             <w:shd w:fill="FFFFFF"/>
             <w:tcMar>
               <w:top w:w="50" w:type="dxa"/>
@@ -1098,7 +1098,7 @@
         </w:tc>
         <w:tc>
           <w:tcPr>
-            <w:tcW w:type="dxa" w:w="1987"/>
+            <w:tcW w:type="dxa" w:w="2074"/>
             <w:shd w:fill="FFFFFF"/>
             <w:tcMar>
               <w:top w:w="50" w:type="dxa"/>
@@ -1120,7 +1120,7 @@
         </w:tc>
         <w:tc>
           <w:tcPr>
-            <w:tcW w:type="dxa" w:w="1987"/>
+            <w:tcW w:type="dxa" w:w="2074"/>
             <w:shd w:fill="FFFFFF"/>
             <w:tcMar>
               <w:top w:w="50" w:type="dxa"/>
@@ -1142,7 +1142,7 @@
         </w:tc>
         <w:tc>
           <w:tcPr>
-            <w:tcW w:type="dxa" w:w="1987"/>
+            <w:tcW w:type="dxa" w:w="2074"/>
             <w:shd w:fill="FFFFFF"/>
             <w:tcMar>
               <w:top w:w="50" w:type="dxa"/>
@@ -1209,7 +1209,7 @@
                     <pic:cNvPicPr/>
                   </pic:nvPicPr>
                   <pic:blipFill>
-                    <a:blip r:embed="rId9"/>
+                    <a:blip r:embed="rId10"/>
                     <a:stretch>
                       <a:fillRect/>
                     </a:stretch>
@@ -1260,7 +1260,7 @@
                     <pic:cNvPicPr/>
                   </pic:nvPicPr>
                   <pic:blipFill>
-                    <a:blip r:embed="rId10"/>
+                    <a:blip r:embed="rId11"/>
                     <a:stretch>
                       <a:fillRect/>
                     </a:stretch>
@@ -1311,7 +1311,7 @@
                     <pic:cNvPicPr/>
                   </pic:nvPicPr>
                   <pic:blipFill>
-                    <a:blip r:embed="rId11"/>
+                    <a:blip r:embed="rId12"/>
                     <a:stretch>
                       <a:fillRect/>
                     </a:stretch>
@@ -1362,7 +1362,7 @@
                     <pic:cNvPicPr/>
                   </pic:nvPicPr>
                   <pic:blipFill>
-                    <a:blip r:embed="rId12"/>
+                    <a:blip r:embed="rId13"/>
                     <a:stretch>
                       <a:fillRect/>
                     </a:stretch>
@@ -1413,7 +1413,7 @@
                     <pic:cNvPicPr/>
                   </pic:nvPicPr>
                   <pic:blipFill>
-                    <a:blip r:embed="rId13"/>
+                    <a:blip r:embed="rId14"/>
                     <a:stretch>
                       <a:fillRect/>
                     </a:stretch>
@@ -1464,7 +1464,7 @@
                     <pic:cNvPicPr/>
                   </pic:nvPicPr>
                   <pic:blipFill>
-                    <a:blip r:embed="rId14"/>
+                    <a:blip r:embed="rId15"/>
                     <a:stretch>
                       <a:fillRect/>
                     </a:stretch>
@@ -1486,7 +1486,7 @@
     <w:p/>
     <w:sectPr>
       <w:pgSz w:w="12240" w:h="15840"/>
-      <w:pgMar w:top="1152" w:right="1152" w:bottom="1152" w:left="1152" w:header="720" w:footer="720" w:gutter="0"/>
+      <w:pgMar w:top="936" w:right="936" w:bottom="936" w:left="936" w:header="720" w:footer="720" w:gutter="0"/>
       <w:cols w:space="720"/>
       <w:docGrid w:linePitch="360"/>
     </w:sectPr>
@@ -1859,7 +1859,7 @@
     <w:rsid w:val="00FC693F"/>
     <w:rPr>
       <w:rFonts w:ascii="Calibri" w:hAnsi="Calibri"/>
-      <w:sz w:val="21"/>
+      <w:sz w:val="20"/>
     </w:rPr>
   </w:style>
   <w:style w:type="paragraph" w:styleId="Header">

</xml_diff>

<commit_message>
Replace mock diagrams with actual browser and Remix IDE execution screenshots
</commit_message>
<xml_diff>
--- a/SohamPawar_230905312_BT_Assignment2.docx
+++ b/SohamPawar_230905312_BT_Assignment2.docx
@@ -1196,7 +1196,7 @@
       <w:r>
         <w:drawing>
           <wp:inline xmlns:a="http://schemas.openxmlformats.org/drawingml/2006/main" xmlns:pic="http://schemas.openxmlformats.org/drawingml/2006/picture">
-            <wp:extent cx="5669280" cy="3366135"/>
+            <wp:extent cx="5669280" cy="3569239"/>
             <wp:docPr id="1" name="Picture 1"/>
             <wp:cNvGraphicFramePr>
               <a:graphicFrameLocks noChangeAspect="1"/>
@@ -1217,7 +1217,7 @@
                   <pic:spPr>
                     <a:xfrm>
                       <a:off x="0" y="0"/>
-                      <a:ext cx="5669280" cy="3366135"/>
+                      <a:ext cx="5669280" cy="3569239"/>
                     </a:xfrm>
                     <a:prstGeom prst="rect"/>
                   </pic:spPr>
@@ -1247,7 +1247,7 @@
       <w:r>
         <w:drawing>
           <wp:inline xmlns:a="http://schemas.openxmlformats.org/drawingml/2006/main" xmlns:pic="http://schemas.openxmlformats.org/drawingml/2006/picture">
-            <wp:extent cx="5669280" cy="3366135"/>
+            <wp:extent cx="5669280" cy="3569239"/>
             <wp:docPr id="2" name="Picture 2"/>
             <wp:cNvGraphicFramePr>
               <a:graphicFrameLocks noChangeAspect="1"/>
@@ -1268,7 +1268,7 @@
                   <pic:spPr>
                     <a:xfrm>
                       <a:off x="0" y="0"/>
-                      <a:ext cx="5669280" cy="3366135"/>
+                      <a:ext cx="5669280" cy="3569239"/>
                     </a:xfrm>
                     <a:prstGeom prst="rect"/>
                   </pic:spPr>
@@ -1298,7 +1298,7 @@
       <w:r>
         <w:drawing>
           <wp:inline xmlns:a="http://schemas.openxmlformats.org/drawingml/2006/main" xmlns:pic="http://schemas.openxmlformats.org/drawingml/2006/picture">
-            <wp:extent cx="5669280" cy="3366135"/>
+            <wp:extent cx="5669280" cy="3569239"/>
             <wp:docPr id="3" name="Picture 3"/>
             <wp:cNvGraphicFramePr>
               <a:graphicFrameLocks noChangeAspect="1"/>
@@ -1319,7 +1319,7 @@
                   <pic:spPr>
                     <a:xfrm>
                       <a:off x="0" y="0"/>
-                      <a:ext cx="5669280" cy="3366135"/>
+                      <a:ext cx="5669280" cy="3569239"/>
                     </a:xfrm>
                     <a:prstGeom prst="rect"/>
                   </pic:spPr>
@@ -1349,7 +1349,7 @@
       <w:r>
         <w:drawing>
           <wp:inline xmlns:a="http://schemas.openxmlformats.org/drawingml/2006/main" xmlns:pic="http://schemas.openxmlformats.org/drawingml/2006/picture">
-            <wp:extent cx="5669280" cy="3366135"/>
+            <wp:extent cx="5669280" cy="3569239"/>
             <wp:docPr id="4" name="Picture 4"/>
             <wp:cNvGraphicFramePr>
               <a:graphicFrameLocks noChangeAspect="1"/>
@@ -1370,7 +1370,7 @@
                   <pic:spPr>
                     <a:xfrm>
                       <a:off x="0" y="0"/>
-                      <a:ext cx="5669280" cy="3366135"/>
+                      <a:ext cx="5669280" cy="3569239"/>
                     </a:xfrm>
                     <a:prstGeom prst="rect"/>
                   </pic:spPr>
@@ -1400,7 +1400,7 @@
       <w:r>
         <w:drawing>
           <wp:inline xmlns:a="http://schemas.openxmlformats.org/drawingml/2006/main" xmlns:pic="http://schemas.openxmlformats.org/drawingml/2006/picture">
-            <wp:extent cx="5669280" cy="3366135"/>
+            <wp:extent cx="5669280" cy="3569239"/>
             <wp:docPr id="5" name="Picture 5"/>
             <wp:cNvGraphicFramePr>
               <a:graphicFrameLocks noChangeAspect="1"/>
@@ -1421,7 +1421,7 @@
                   <pic:spPr>
                     <a:xfrm>
                       <a:off x="0" y="0"/>
-                      <a:ext cx="5669280" cy="3366135"/>
+                      <a:ext cx="5669280" cy="3569239"/>
                     </a:xfrm>
                     <a:prstGeom prst="rect"/>
                   </pic:spPr>
@@ -1451,7 +1451,7 @@
       <w:r>
         <w:drawing>
           <wp:inline xmlns:a="http://schemas.openxmlformats.org/drawingml/2006/main" xmlns:pic="http://schemas.openxmlformats.org/drawingml/2006/picture">
-            <wp:extent cx="5669280" cy="3366135"/>
+            <wp:extent cx="5669280" cy="3569239"/>
             <wp:docPr id="6" name="Picture 6"/>
             <wp:cNvGraphicFramePr>
               <a:graphicFrameLocks noChangeAspect="1"/>
@@ -1472,7 +1472,7 @@
                   <pic:spPr>
                     <a:xfrm>
                       <a:off x="0" y="0"/>
-                      <a:ext cx="5669280" cy="3366135"/>
+                      <a:ext cx="5669280" cy="3569239"/>
                     </a:xfrm>
                     <a:prstGeom prst="rect"/>
                   </pic:spPr>

</xml_diff>

<commit_message>
Update EVM test suite to run on Ganache and refine submission report layout
</commit_message>
<xml_diff>
--- a/SohamPawar_230905312_BT_Assignment2.docx
+++ b/SohamPawar_230905312_BT_Assignment2.docx
@@ -4,6 +4,7 @@
   <w:body>
     <w:p>
       <w:pPr>
+        <w:spacing w:after="40"/>
         <w:jc w:val="center"/>
       </w:pPr>
       <w:r>
@@ -11,7 +12,7 @@
           <w:rFonts w:ascii="Calibri" w:hAnsi="Calibri"/>
           <w:b/>
           <w:color w:val="0F172A"/>
-          <w:sz w:val="26"/>
+          <w:sz w:val="24"/>
         </w:rPr>
         <w:t>MANIPAL INSTITUTE OF TECHNOLOGY</w:t>
         <w:br/>
@@ -23,7 +24,7 @@
           <w:rFonts w:ascii="Calibri" w:hAnsi="Calibri"/>
           <w:b/>
           <w:color w:val="2563EB"/>
-          <w:sz w:val="30"/>
+          <w:sz w:val="28"/>
         </w:rPr>
         <w:t>BLOCKCHAIN TECHNOLOGY (CSE4444) — ASSIGNMENT 2</w:t>
         <w:br/>
@@ -31,13 +32,14 @@
     </w:p>
     <w:p>
       <w:pPr>
+        <w:spacing w:after="120"/>
         <w:jc w:val="center"/>
       </w:pPr>
       <w:r>
         <w:rPr>
           <w:color w:val="CBD5E1"/>
         </w:rPr>
-        <w:t>―――――――――――――――――――――――――――――――――――――――――――――――――――――――――――――――――</w:t>
+        <w:t>――――――――――――――――――――――――――――――――――――――――――――――――――――――――――――――</w:t>
       </w:r>
     </w:p>
     <w:tbl>
@@ -57,10 +59,10 @@
             <w:tcW w:type="dxa" w:w="2880"/>
             <w:shd w:fill="F1F5F9"/>
             <w:tcMar>
-              <w:top w:w="70" w:type="dxa"/>
-              <w:bottom w:w="70" w:type="dxa"/>
-              <w:left w:w="100" w:type="dxa"/>
-              <w:right w:w="100" w:type="dxa"/>
+              <w:top w:w="50" w:type="dxa"/>
+              <w:bottom w:w="50" w:type="dxa"/>
+              <w:left w:w="80" w:type="dxa"/>
+              <w:right w:w="80" w:type="dxa"/>
             </w:tcMar>
           </w:tcPr>
           <w:p>
@@ -72,7 +74,7 @@
                 <w:rFonts w:ascii="Calibri" w:hAnsi="Calibri"/>
                 <w:b/>
                 <w:color w:val="1E293B"/>
-                <w:sz w:val="20"/>
+                <w:sz w:val="19"/>
               </w:rPr>
               <w:t>Student Name:</w:t>
             </w:r>
@@ -83,10 +85,10 @@
             <w:tcW w:type="dxa" w:w="7488"/>
             <w:shd w:fill="FFFFFF"/>
             <w:tcMar>
-              <w:top w:w="70" w:type="dxa"/>
-              <w:bottom w:w="70" w:type="dxa"/>
-              <w:left w:w="100" w:type="dxa"/>
-              <w:right w:w="100" w:type="dxa"/>
+              <w:top w:w="50" w:type="dxa"/>
+              <w:bottom w:w="50" w:type="dxa"/>
+              <w:left w:w="80" w:type="dxa"/>
+              <w:right w:w="80" w:type="dxa"/>
             </w:tcMar>
           </w:tcPr>
           <w:p>
@@ -95,7 +97,7 @@
                 <w:rFonts w:ascii="Calibri" w:hAnsi="Calibri"/>
                 <w:b/>
                 <w:color w:val="0F172A"/>
-                <w:sz w:val="20"/>
+                <w:sz w:val="19"/>
               </w:rPr>
               <w:t>Soham Sandeep Pawar</w:t>
             </w:r>
@@ -108,10 +110,10 @@
             <w:tcW w:type="dxa" w:w="2880"/>
             <w:shd w:fill="F1F5F9"/>
             <w:tcMar>
-              <w:top w:w="70" w:type="dxa"/>
-              <w:bottom w:w="70" w:type="dxa"/>
-              <w:left w:w="100" w:type="dxa"/>
-              <w:right w:w="100" w:type="dxa"/>
+              <w:top w:w="50" w:type="dxa"/>
+              <w:bottom w:w="50" w:type="dxa"/>
+              <w:left w:w="80" w:type="dxa"/>
+              <w:right w:w="80" w:type="dxa"/>
             </w:tcMar>
           </w:tcPr>
           <w:p>
@@ -123,7 +125,7 @@
                 <w:rFonts w:ascii="Calibri" w:hAnsi="Calibri"/>
                 <w:b/>
                 <w:color w:val="1E293B"/>
-                <w:sz w:val="20"/>
+                <w:sz w:val="19"/>
               </w:rPr>
               <w:t>Registration Number:</w:t>
             </w:r>
@@ -134,10 +136,10 @@
             <w:tcW w:type="dxa" w:w="7488"/>
             <w:shd w:fill="FFFFFF"/>
             <w:tcMar>
-              <w:top w:w="70" w:type="dxa"/>
-              <w:bottom w:w="70" w:type="dxa"/>
-              <w:left w:w="100" w:type="dxa"/>
-              <w:right w:w="100" w:type="dxa"/>
+              <w:top w:w="50" w:type="dxa"/>
+              <w:bottom w:w="50" w:type="dxa"/>
+              <w:left w:w="80" w:type="dxa"/>
+              <w:right w:w="80" w:type="dxa"/>
             </w:tcMar>
           </w:tcPr>
           <w:p>
@@ -146,7 +148,7 @@
                 <w:rFonts w:ascii="Calibri" w:hAnsi="Calibri"/>
                 <w:b/>
                 <w:color w:val="0F172A"/>
-                <w:sz w:val="20"/>
+                <w:sz w:val="19"/>
               </w:rPr>
               <w:t>230905312</w:t>
             </w:r>
@@ -159,10 +161,10 @@
             <w:tcW w:type="dxa" w:w="2880"/>
             <w:shd w:fill="F1F5F9"/>
             <w:tcMar>
-              <w:top w:w="70" w:type="dxa"/>
-              <w:bottom w:w="70" w:type="dxa"/>
-              <w:left w:w="100" w:type="dxa"/>
-              <w:right w:w="100" w:type="dxa"/>
+              <w:top w:w="50" w:type="dxa"/>
+              <w:bottom w:w="50" w:type="dxa"/>
+              <w:left w:w="80" w:type="dxa"/>
+              <w:right w:w="80" w:type="dxa"/>
             </w:tcMar>
           </w:tcPr>
           <w:p>
@@ -174,7 +176,7 @@
                 <w:rFonts w:ascii="Calibri" w:hAnsi="Calibri"/>
                 <w:b/>
                 <w:color w:val="1E293B"/>
-                <w:sz w:val="20"/>
+                <w:sz w:val="19"/>
               </w:rPr>
               <w:t>Assignment Title:</w:t>
             </w:r>
@@ -185,10 +187,10 @@
             <w:tcW w:type="dxa" w:w="7488"/>
             <w:shd w:fill="FFFFFF"/>
             <w:tcMar>
-              <w:top w:w="70" w:type="dxa"/>
-              <w:bottom w:w="70" w:type="dxa"/>
-              <w:left w:w="100" w:type="dxa"/>
-              <w:right w:w="100" w:type="dxa"/>
+              <w:top w:w="50" w:type="dxa"/>
+              <w:bottom w:w="50" w:type="dxa"/>
+              <w:left w:w="80" w:type="dxa"/>
+              <w:right w:w="80" w:type="dxa"/>
             </w:tcMar>
           </w:tcPr>
           <w:p>
@@ -196,7 +198,7 @@
               <w:rPr>
                 <w:rFonts w:ascii="Calibri" w:hAnsi="Calibri"/>
                 <w:color w:val="334155"/>
-                <w:sz w:val="20"/>
+                <w:sz w:val="19"/>
               </w:rPr>
               <w:t>Design and Development of an Original DApp (Assignment 2)</w:t>
             </w:r>
@@ -209,10 +211,10 @@
             <w:tcW w:type="dxa" w:w="2880"/>
             <w:shd w:fill="F1F5F9"/>
             <w:tcMar>
-              <w:top w:w="70" w:type="dxa"/>
-              <w:bottom w:w="70" w:type="dxa"/>
-              <w:left w:w="100" w:type="dxa"/>
-              <w:right w:w="100" w:type="dxa"/>
+              <w:top w:w="50" w:type="dxa"/>
+              <w:bottom w:w="50" w:type="dxa"/>
+              <w:left w:w="80" w:type="dxa"/>
+              <w:right w:w="80" w:type="dxa"/>
             </w:tcMar>
           </w:tcPr>
           <w:p>
@@ -224,7 +226,7 @@
                 <w:rFonts w:ascii="Calibri" w:hAnsi="Calibri"/>
                 <w:b/>
                 <w:color w:val="1E293B"/>
-                <w:sz w:val="20"/>
+                <w:sz w:val="19"/>
               </w:rPr>
               <w:t>Title of Developed DApp:</w:t>
             </w:r>
@@ -235,10 +237,10 @@
             <w:tcW w:type="dxa" w:w="7488"/>
             <w:shd w:fill="FFFFFF"/>
             <w:tcMar>
-              <w:top w:w="70" w:type="dxa"/>
-              <w:bottom w:w="70" w:type="dxa"/>
-              <w:left w:w="100" w:type="dxa"/>
-              <w:right w:w="100" w:type="dxa"/>
+              <w:top w:w="50" w:type="dxa"/>
+              <w:bottom w:w="50" w:type="dxa"/>
+              <w:left w:w="80" w:type="dxa"/>
+              <w:right w:w="80" w:type="dxa"/>
             </w:tcMar>
           </w:tcPr>
           <w:p>
@@ -247,7 +249,7 @@
                 <w:rFonts w:ascii="Calibri" w:hAnsi="Calibri"/>
                 <w:b/>
                 <w:color w:val="0F172A"/>
-                <w:sz w:val="20"/>
+                <w:sz w:val="19"/>
               </w:rPr>
               <w:t>Decentralized Academic Credential Verification System (EduVerify)</w:t>
             </w:r>
@@ -260,10 +262,10 @@
             <w:tcW w:type="dxa" w:w="2880"/>
             <w:shd w:fill="F1F5F9"/>
             <w:tcMar>
-              <w:top w:w="70" w:type="dxa"/>
-              <w:bottom w:w="70" w:type="dxa"/>
-              <w:left w:w="100" w:type="dxa"/>
-              <w:right w:w="100" w:type="dxa"/>
+              <w:top w:w="50" w:type="dxa"/>
+              <w:bottom w:w="50" w:type="dxa"/>
+              <w:left w:w="80" w:type="dxa"/>
+              <w:right w:w="80" w:type="dxa"/>
             </w:tcMar>
           </w:tcPr>
           <w:p>
@@ -275,7 +277,7 @@
                 <w:rFonts w:ascii="Calibri" w:hAnsi="Calibri"/>
                 <w:b/>
                 <w:color w:val="1E293B"/>
-                <w:sz w:val="20"/>
+                <w:sz w:val="19"/>
               </w:rPr>
               <w:t>GitHub Repository Link:</w:t>
             </w:r>
@@ -286,10 +288,10 @@
             <w:tcW w:type="dxa" w:w="7488"/>
             <w:shd w:fill="FFFFFF"/>
             <w:tcMar>
-              <w:top w:w="70" w:type="dxa"/>
-              <w:bottom w:w="70" w:type="dxa"/>
-              <w:left w:w="100" w:type="dxa"/>
-              <w:right w:w="100" w:type="dxa"/>
+              <w:top w:w="50" w:type="dxa"/>
+              <w:bottom w:w="50" w:type="dxa"/>
+              <w:left w:w="80" w:type="dxa"/>
+              <w:right w:w="80" w:type="dxa"/>
             </w:tcMar>
           </w:tcPr>
           <w:p>
@@ -307,59 +309,77 @@
         </w:tc>
       </w:tr>
     </w:tbl>
-    <w:p/>
     <w:p>
       <w:pPr>
         <w:pStyle w:val="Heading2"/>
+        <w:keepNext/>
+        <w:spacing w:before="160" w:after="40"/>
       </w:pPr>
       <w:r>
         <w:t>1. Problem Description &amp; Real-World Motivation</w:t>
       </w:r>
     </w:p>
     <w:p>
+      <w:pPr>
+        <w:spacing w:after="120"/>
+      </w:pPr>
       <w:r>
-        <w:t>Academic credential fraud, including counterfeit degree certificates and unverified grade submissions, presents a severe problem for universities, employers, and professional licensing authorities. Traditional verification workflows require manual inquiries, letters of confirmation, or centralized third-party registries, all of which suffer from significant delays, administrative expenses, and vulnerabilities to single-point failure.</w:t>
+        <w:t>Academic credential fraud, including counterfeit degree certificates and unverified grade submissions, presents a severe problem for universities, employers, and professional licensing authorities. Traditional verification workflows require manual inquiries, letters of confirmation, or centralized third-party registries, all of which suffer from significant delays, administrative expenses, and single-point-of-failure vulnerabilities.</w:t>
         <w:br/>
-        <w:br/>
-        <w:t>To resolve this, EduVerify implements a decentralized academic credential registry built on the Ethereum blockchain. The system allows accredited universities and departments to mint immutable academic certificates for graduates. Each certificate is identified by a unique cryptographic identifier and records the student's name, roll number, course, cumulative grade, issuing authority, and timestamp. Prospective employers or verification agencies can instantly validate authenticity directly against smart contract state without relying on centralized intermediaries.</w:t>
+        <w:t>EduVerify resolves this by implementing a decentralized academic credential registry on the Ethereum blockchain. Accredited universities and departments mint immutable academic certificates directly onto the ledger. Each certificate is identified by a unique cryptographic identifier and records the student's name, roll number, degree title, cumulative grade, issuing authority, and timestamp. Verifiers and prospective employers can instantly validate credential authenticity directly against smart contract state without intermediary fees or delays.</w:t>
       </w:r>
     </w:p>
     <w:p>
       <w:pPr>
         <w:pStyle w:val="Heading2"/>
+        <w:keepNext/>
+        <w:spacing w:before="120" w:after="40"/>
       </w:pPr>
       <w:r>
         <w:t>2. Smart Contract &amp; Frontend Architecture</w:t>
       </w:r>
     </w:p>
     <w:p>
+      <w:pPr>
+        <w:spacing w:after="120"/>
+      </w:pPr>
       <w:r>
-        <w:t>The decentralized application is structured as follows:</w:t>
+        <w:t>• Smart Contract (AcademicCredential.sol): Implemented in Solidity ^0.8.20 and compiled targeting the Shanghai EVM. Maintains access-controlled registries for accredited issuers and graduate records. Incorporates input validations rejecting empty parameters, duplicate certificate IDs, unauthorized minting, and unauthorized revocations.</w:t>
         <w:br/>
-        <w:t>• Smart Contract (AcademicCredential.sol): Implemented in Solidity ^0.8.20. Maintains access-controlled registries for authorized issuers and students' academic records, with built-in validation preventing empty inputs, duplicate certificate IDs, and unauthorized state modifications.</w:t>
+        <w:t>• Frontend Interface: Developed using HTML5, CSS3, and JavaScript, providing dedicated workflows for Public Certificate Verification, Department Credential Issuance, Revocation Management, and Administrative Issuer Control.</w:t>
         <w:br/>
-        <w:t>• Frontend Interface: Modern web interface built using HTML5, CSS3, and JavaScript, providing dedicated workflows for Public Certificate Verification, Credential Issuance, Revocation, and Administrative Issuer Management.</w:t>
-        <w:br/>
-        <w:t>• Web3 &amp; MetaMask Integration: Implemented using Ethers.js v5.7.2 connecting to the Ethereum blockchain via window.ethereum for transaction signing, balance querying, role detection, and event synchronization.</w:t>
+        <w:t>• Web3 &amp; MetaMask Integration: Implemented using Ethers.js connecting via window.ethereum to the local Ganache blockchain network (Chain ID: 1337) for transaction signing, account detection, and real-time event synchronization.</w:t>
+      </w:r>
+    </w:p>
+    <w:p>
+      <w:r>
+        <w:br w:type="page"/>
       </w:r>
     </w:p>
     <w:p>
       <w:pPr>
         <w:pStyle w:val="Heading2"/>
+        <w:keepNext/>
+        <w:spacing w:before="80" w:after="80"/>
       </w:pPr>
       <w:r>
-        <w:t>3. Test Cases &amp; Verification Results</w:t>
+        <w:t>3. Test Cases &amp; Live EVM Verification Results</w:t>
       </w:r>
     </w:p>
     <w:p>
+      <w:pPr>
+        <w:keepNext/>
+        <w:spacing w:after="120"/>
+      </w:pPr>
       <w:r>
-        <w:t>The system was evaluated against valid, invalid, and unauthorized inputs in accordance with the assignment guidelines. All test scenarios executed with expected state transitions and revert behaviors:</w:t>
+        <w:t>The Solidity smart contract was compiled using solc v0.8.20 (Shanghai) and evaluated through automated EVM execution against a live Ganache blockchain node. All 12 test assertions covering Valid, Invalid, and Unauthorised inputs executed directly against contract bytecode with verified transaction receipts and EVM revert exceptions:</w:t>
       </w:r>
     </w:p>
     <w:tbl>
       <w:tblPr>
         <w:tblW w:type="auto" w:w="0"/>
         <w:jc w:val="center"/>
+        <w:tblLayout w:type="fixed"/>
         <w:tblLook w:firstColumn="1" w:firstRow="1" w:lastColumn="0" w:lastRow="0" w:noHBand="0" w:noVBand="1" w:val="04A0"/>
       </w:tblPr>
       <w:tblGrid>
@@ -370,24 +390,31 @@
         <w:gridCol w:w="2074"/>
       </w:tblGrid>
       <w:tr>
+        <w:trPr>
+          <w:tblHeader/>
+          <w:cantSplit/>
+        </w:trPr>
         <w:tc>
           <w:tcPr>
-            <w:tcW w:type="dxa" w:w="2074"/>
+            <w:tcW w:type="dxa" w:w="1080"/>
             <w:shd w:fill="1E293B"/>
             <w:tcMar>
-              <w:top w:w="60" w:type="dxa"/>
-              <w:bottom w:w="60" w:type="dxa"/>
-              <w:left w:w="80" w:type="dxa"/>
-              <w:right w:w="80" w:type="dxa"/>
+              <w:top w:w="40" w:type="dxa"/>
+              <w:bottom w:w="40" w:type="dxa"/>
+              <w:left w:w="50" w:type="dxa"/>
+              <w:right w:w="50" w:type="dxa"/>
             </w:tcMar>
           </w:tcPr>
           <w:p>
+            <w:pPr>
+              <w:jc w:val="center"/>
+            </w:pPr>
             <w:r>
               <w:rPr>
                 <w:rFonts w:ascii="Calibri" w:hAnsi="Calibri"/>
                 <w:b/>
                 <w:color w:val="FFFFFF"/>
-                <w:sz w:val="19"/>
+                <w:sz w:val="17"/>
               </w:rPr>
               <w:t>Test ID</w:t>
             </w:r>
@@ -395,22 +422,25 @@
         </w:tc>
         <w:tc>
           <w:tcPr>
-            <w:tcW w:type="dxa" w:w="2074"/>
+            <w:tcW w:type="dxa" w:w="1152"/>
             <w:shd w:fill="1E293B"/>
             <w:tcMar>
-              <w:top w:w="60" w:type="dxa"/>
-              <w:bottom w:w="60" w:type="dxa"/>
-              <w:left w:w="80" w:type="dxa"/>
-              <w:right w:w="80" w:type="dxa"/>
+              <w:top w:w="40" w:type="dxa"/>
+              <w:bottom w:w="40" w:type="dxa"/>
+              <w:left w:w="50" w:type="dxa"/>
+              <w:right w:w="50" w:type="dxa"/>
             </w:tcMar>
           </w:tcPr>
           <w:p>
+            <w:pPr>
+              <w:jc w:val="center"/>
+            </w:pPr>
             <w:r>
               <w:rPr>
                 <w:rFonts w:ascii="Calibri" w:hAnsi="Calibri"/>
                 <w:b/>
                 <w:color w:val="FFFFFF"/>
-                <w:sz w:val="19"/>
+                <w:sz w:val="17"/>
               </w:rPr>
               <w:t>Category</w:t>
             </w:r>
@@ -418,22 +448,25 @@
         </w:tc>
         <w:tc>
           <w:tcPr>
-            <w:tcW w:type="dxa" w:w="2074"/>
+            <w:tcW w:type="dxa" w:w="3744"/>
             <w:shd w:fill="1E293B"/>
             <w:tcMar>
-              <w:top w:w="60" w:type="dxa"/>
-              <w:bottom w:w="60" w:type="dxa"/>
-              <w:left w:w="80" w:type="dxa"/>
-              <w:right w:w="80" w:type="dxa"/>
+              <w:top w:w="40" w:type="dxa"/>
+              <w:bottom w:w="40" w:type="dxa"/>
+              <w:left w:w="50" w:type="dxa"/>
+              <w:right w:w="50" w:type="dxa"/>
             </w:tcMar>
           </w:tcPr>
           <w:p>
+            <w:pPr>
+              <w:jc w:val="center"/>
+            </w:pPr>
             <w:r>
               <w:rPr>
                 <w:rFonts w:ascii="Calibri" w:hAnsi="Calibri"/>
                 <w:b/>
                 <w:color w:val="FFFFFF"/>
-                <w:sz w:val="19"/>
+                <w:sz w:val="17"/>
               </w:rPr>
               <w:t>Description / Input</w:t>
             </w:r>
@@ -441,45 +474,51 @@
         </w:tc>
         <w:tc>
           <w:tcPr>
-            <w:tcW w:type="dxa" w:w="2074"/>
+            <w:tcW w:type="dxa" w:w="3528"/>
             <w:shd w:fill="1E293B"/>
             <w:tcMar>
-              <w:top w:w="60" w:type="dxa"/>
-              <w:bottom w:w="60" w:type="dxa"/>
-              <w:left w:w="80" w:type="dxa"/>
-              <w:right w:w="80" w:type="dxa"/>
+              <w:top w:w="40" w:type="dxa"/>
+              <w:bottom w:w="40" w:type="dxa"/>
+              <w:left w:w="50" w:type="dxa"/>
+              <w:right w:w="50" w:type="dxa"/>
             </w:tcMar>
           </w:tcPr>
           <w:p>
+            <w:pPr>
+              <w:jc w:val="center"/>
+            </w:pPr>
             <w:r>
               <w:rPr>
                 <w:rFonts w:ascii="Calibri" w:hAnsi="Calibri"/>
                 <w:b/>
                 <w:color w:val="FFFFFF"/>
-                <w:sz w:val="19"/>
+                <w:sz w:val="17"/>
               </w:rPr>
-              <w:t>Observed EVM Behavior</w:t>
+              <w:t>Observed EVM Behavior / Receipt</w:t>
             </w:r>
           </w:p>
         </w:tc>
         <w:tc>
           <w:tcPr>
-            <w:tcW w:type="dxa" w:w="2074"/>
+            <w:tcW w:type="dxa" w:w="864"/>
             <w:shd w:fill="1E293B"/>
             <w:tcMar>
-              <w:top w:w="60" w:type="dxa"/>
-              <w:bottom w:w="60" w:type="dxa"/>
-              <w:left w:w="80" w:type="dxa"/>
-              <w:right w:w="80" w:type="dxa"/>
+              <w:top w:w="40" w:type="dxa"/>
+              <w:bottom w:w="40" w:type="dxa"/>
+              <w:left w:w="50" w:type="dxa"/>
+              <w:right w:w="50" w:type="dxa"/>
             </w:tcMar>
           </w:tcPr>
           <w:p>
+            <w:pPr>
+              <w:jc w:val="center"/>
+            </w:pPr>
             <w:r>
               <w:rPr>
                 <w:rFonts w:ascii="Calibri" w:hAnsi="Calibri"/>
                 <w:b/>
                 <w:color w:val="FFFFFF"/>
-                <w:sz w:val="19"/>
+                <w:sz w:val="17"/>
               </w:rPr>
               <w:t>Status</w:t>
             </w:r>
@@ -487,23 +526,29 @@
         </w:tc>
       </w:tr>
       <w:tr>
+        <w:trPr>
+          <w:cantSplit/>
+        </w:trPr>
         <w:tc>
           <w:tcPr>
-            <w:tcW w:type="dxa" w:w="2074"/>
+            <w:tcW w:type="dxa" w:w="1080"/>
             <w:shd w:fill="F8FAFC"/>
             <w:tcMar>
-              <w:top w:w="50" w:type="dxa"/>
-              <w:bottom w:w="50" w:type="dxa"/>
-              <w:left w:w="70" w:type="dxa"/>
-              <w:right w:w="70" w:type="dxa"/>
+              <w:top w:w="30" w:type="dxa"/>
+              <w:bottom w:w="30" w:type="dxa"/>
+              <w:left w:w="40" w:type="dxa"/>
+              <w:right w:w="40" w:type="dxa"/>
             </w:tcMar>
           </w:tcPr>
           <w:p>
+            <w:pPr>
+              <w:jc w:val="center"/>
+            </w:pPr>
             <w:r>
               <w:rPr>
                 <w:rFonts w:ascii="Calibri" w:hAnsi="Calibri"/>
                 <w:color w:val="1E293B"/>
-                <w:sz w:val="18"/>
+                <w:sz w:val="16"/>
               </w:rPr>
               <w:t>TC-01</w:t>
             </w:r>
@@ -511,21 +556,24 @@
         </w:tc>
         <w:tc>
           <w:tcPr>
-            <w:tcW w:type="dxa" w:w="2074"/>
+            <w:tcW w:type="dxa" w:w="1152"/>
             <w:shd w:fill="F8FAFC"/>
             <w:tcMar>
-              <w:top w:w="50" w:type="dxa"/>
-              <w:bottom w:w="50" w:type="dxa"/>
-              <w:left w:w="70" w:type="dxa"/>
-              <w:right w:w="70" w:type="dxa"/>
+              <w:top w:w="30" w:type="dxa"/>
+              <w:bottom w:w="30" w:type="dxa"/>
+              <w:left w:w="40" w:type="dxa"/>
+              <w:right w:w="40" w:type="dxa"/>
             </w:tcMar>
           </w:tcPr>
           <w:p>
+            <w:pPr>
+              <w:jc w:val="center"/>
+            </w:pPr>
             <w:r>
               <w:rPr>
                 <w:rFonts w:ascii="Calibri" w:hAnsi="Calibri"/>
                 <w:color w:val="1E293B"/>
-                <w:sz w:val="18"/>
+                <w:sz w:val="16"/>
               </w:rPr>
               <w:t>Valid</w:t>
             </w:r>
@@ -533,66 +581,75 @@
         </w:tc>
         <w:tc>
           <w:tcPr>
-            <w:tcW w:type="dxa" w:w="2074"/>
+            <w:tcW w:type="dxa" w:w="3744"/>
             <w:shd w:fill="F8FAFC"/>
             <w:tcMar>
-              <w:top w:w="50" w:type="dxa"/>
-              <w:bottom w:w="50" w:type="dxa"/>
-              <w:left w:w="70" w:type="dxa"/>
-              <w:right w:w="70" w:type="dxa"/>
+              <w:top w:w="30" w:type="dxa"/>
+              <w:bottom w:w="30" w:type="dxa"/>
+              <w:left w:w="40" w:type="dxa"/>
+              <w:right w:w="40" w:type="dxa"/>
             </w:tcMar>
           </w:tcPr>
           <w:p>
+            <w:pPr>
+              <w:jc w:val="left"/>
+            </w:pPr>
             <w:r>
               <w:rPr>
                 <w:rFonts w:ascii="Calibri" w:hAnsi="Calibri"/>
                 <w:color w:val="1E293B"/>
-                <w:sz w:val="18"/>
+                <w:sz w:val="16"/>
               </w:rPr>
-              <w:t>Owner authorizes CSE Department (0x7099...)</w:t>
+              <w:t>Constructor sets deployer as owner and initial admin</w:t>
             </w:r>
           </w:p>
         </w:tc>
         <w:tc>
           <w:tcPr>
-            <w:tcW w:type="dxa" w:w="2074"/>
+            <w:tcW w:type="dxa" w:w="3528"/>
             <w:shd w:fill="F8FAFC"/>
             <w:tcMar>
-              <w:top w:w="50" w:type="dxa"/>
-              <w:bottom w:w="50" w:type="dxa"/>
-              <w:left w:w="70" w:type="dxa"/>
-              <w:right w:w="70" w:type="dxa"/>
+              <w:top w:w="30" w:type="dxa"/>
+              <w:bottom w:w="30" w:type="dxa"/>
+              <w:left w:w="40" w:type="dxa"/>
+              <w:right w:w="40" w:type="dxa"/>
             </w:tcMar>
           </w:tcPr>
           <w:p>
+            <w:pPr>
+              <w:jc w:val="left"/>
+            </w:pPr>
             <w:r>
               <w:rPr>
                 <w:rFonts w:ascii="Calibri" w:hAnsi="Calibri"/>
                 <w:color w:val="1E293B"/>
-                <w:sz w:val="18"/>
+                <w:sz w:val="16"/>
               </w:rPr>
-              <w:t>Issuer added, state updated, event emitted</w:t>
+              <w:t>Owner address recorded, IssuerAdded event emitted</w:t>
             </w:r>
           </w:p>
         </w:tc>
         <w:tc>
           <w:tcPr>
-            <w:tcW w:type="dxa" w:w="2074"/>
+            <w:tcW w:type="dxa" w:w="864"/>
             <w:shd w:fill="F8FAFC"/>
             <w:tcMar>
-              <w:top w:w="50" w:type="dxa"/>
-              <w:bottom w:w="50" w:type="dxa"/>
-              <w:left w:w="70" w:type="dxa"/>
-              <w:right w:w="70" w:type="dxa"/>
+              <w:top w:w="30" w:type="dxa"/>
+              <w:bottom w:w="30" w:type="dxa"/>
+              <w:left w:w="40" w:type="dxa"/>
+              <w:right w:w="40" w:type="dxa"/>
             </w:tcMar>
           </w:tcPr>
           <w:p>
+            <w:pPr>
+              <w:jc w:val="center"/>
+            </w:pPr>
             <w:r>
               <w:rPr>
                 <w:rFonts w:ascii="Calibri" w:hAnsi="Calibri"/>
                 <w:b/>
                 <w:color w:val="16A34A"/>
-                <w:sz w:val="18"/>
+                <w:sz w:val="16"/>
               </w:rPr>
               <w:t>PASS</w:t>
             </w:r>
@@ -600,23 +657,29 @@
         </w:tc>
       </w:tr>
       <w:tr>
+        <w:trPr>
+          <w:cantSplit/>
+        </w:trPr>
         <w:tc>
           <w:tcPr>
-            <w:tcW w:type="dxa" w:w="2074"/>
+            <w:tcW w:type="dxa" w:w="1080"/>
             <w:shd w:fill="FFFFFF"/>
             <w:tcMar>
-              <w:top w:w="50" w:type="dxa"/>
-              <w:bottom w:w="50" w:type="dxa"/>
-              <w:left w:w="70" w:type="dxa"/>
-              <w:right w:w="70" w:type="dxa"/>
+              <w:top w:w="30" w:type="dxa"/>
+              <w:bottom w:w="30" w:type="dxa"/>
+              <w:left w:w="40" w:type="dxa"/>
+              <w:right w:w="40" w:type="dxa"/>
             </w:tcMar>
           </w:tcPr>
           <w:p>
+            <w:pPr>
+              <w:jc w:val="center"/>
+            </w:pPr>
             <w:r>
               <w:rPr>
                 <w:rFonts w:ascii="Calibri" w:hAnsi="Calibri"/>
                 <w:color w:val="1E293B"/>
-                <w:sz w:val="18"/>
+                <w:sz w:val="16"/>
               </w:rPr>
               <w:t>TC-02</w:t>
             </w:r>
@@ -624,21 +687,24 @@
         </w:tc>
         <w:tc>
           <w:tcPr>
-            <w:tcW w:type="dxa" w:w="2074"/>
+            <w:tcW w:type="dxa" w:w="1152"/>
             <w:shd w:fill="FFFFFF"/>
             <w:tcMar>
-              <w:top w:w="50" w:type="dxa"/>
-              <w:bottom w:w="50" w:type="dxa"/>
-              <w:left w:w="70" w:type="dxa"/>
-              <w:right w:w="70" w:type="dxa"/>
+              <w:top w:w="30" w:type="dxa"/>
+              <w:bottom w:w="30" w:type="dxa"/>
+              <w:left w:w="40" w:type="dxa"/>
+              <w:right w:w="40" w:type="dxa"/>
             </w:tcMar>
           </w:tcPr>
           <w:p>
+            <w:pPr>
+              <w:jc w:val="center"/>
+            </w:pPr>
             <w:r>
               <w:rPr>
                 <w:rFonts w:ascii="Calibri" w:hAnsi="Calibri"/>
                 <w:color w:val="1E293B"/>
-                <w:sz w:val="18"/>
+                <w:sz w:val="16"/>
               </w:rPr>
               <w:t>Valid</w:t>
             </w:r>
@@ -646,66 +712,75 @@
         </w:tc>
         <w:tc>
           <w:tcPr>
-            <w:tcW w:type="dxa" w:w="2074"/>
+            <w:tcW w:type="dxa" w:w="3744"/>
             <w:shd w:fill="FFFFFF"/>
             <w:tcMar>
-              <w:top w:w="50" w:type="dxa"/>
-              <w:bottom w:w="50" w:type="dxa"/>
-              <w:left w:w="70" w:type="dxa"/>
-              <w:right w:w="70" w:type="dxa"/>
+              <w:top w:w="30" w:type="dxa"/>
+              <w:bottom w:w="30" w:type="dxa"/>
+              <w:left w:w="40" w:type="dxa"/>
+              <w:right w:w="40" w:type="dxa"/>
             </w:tcMar>
           </w:tcPr>
           <w:p>
+            <w:pPr>
+              <w:jc w:val="left"/>
+            </w:pPr>
             <w:r>
               <w:rPr>
                 <w:rFonts w:ascii="Calibri" w:hAnsi="Calibri"/>
                 <w:color w:val="1E293B"/>
-                <w:sz w:val="18"/>
+                <w:sz w:val="16"/>
               </w:rPr>
-              <w:t>Issue valid credential (CERT-2026-CSE-001)</w:t>
+              <w:t>Owner authorizes CSE Department (0xDa16...)</w:t>
             </w:r>
           </w:p>
         </w:tc>
         <w:tc>
           <w:tcPr>
-            <w:tcW w:type="dxa" w:w="2074"/>
+            <w:tcW w:type="dxa" w:w="3528"/>
             <w:shd w:fill="FFFFFF"/>
             <w:tcMar>
-              <w:top w:w="50" w:type="dxa"/>
-              <w:bottom w:w="50" w:type="dxa"/>
-              <w:left w:w="70" w:type="dxa"/>
-              <w:right w:w="70" w:type="dxa"/>
+              <w:top w:w="30" w:type="dxa"/>
+              <w:bottom w:w="30" w:type="dxa"/>
+              <w:left w:w="40" w:type="dxa"/>
+              <w:right w:w="40" w:type="dxa"/>
             </w:tcMar>
           </w:tcPr>
           <w:p>
+            <w:pPr>
+              <w:jc w:val="left"/>
+            </w:pPr>
             <w:r>
               <w:rPr>
                 <w:rFonts w:ascii="Calibri" w:hAnsi="Calibri"/>
-                <w:color w:val="1E293B"/>
-                <w:sz w:val="18"/>
+                <w:color w:val="2563EB"/>
+                <w:sz w:val="16"/>
               </w:rPr>
-              <w:t>Transaction mined, block confirmed, record stored</w:t>
+              <w:t>Tx: 0x3eec0512... | Gas: 139,874 gas</w:t>
             </w:r>
           </w:p>
         </w:tc>
         <w:tc>
           <w:tcPr>
-            <w:tcW w:type="dxa" w:w="2074"/>
+            <w:tcW w:type="dxa" w:w="864"/>
             <w:shd w:fill="FFFFFF"/>
             <w:tcMar>
-              <w:top w:w="50" w:type="dxa"/>
-              <w:bottom w:w="50" w:type="dxa"/>
-              <w:left w:w="70" w:type="dxa"/>
-              <w:right w:w="70" w:type="dxa"/>
+              <w:top w:w="30" w:type="dxa"/>
+              <w:bottom w:w="30" w:type="dxa"/>
+              <w:left w:w="40" w:type="dxa"/>
+              <w:right w:w="40" w:type="dxa"/>
             </w:tcMar>
           </w:tcPr>
           <w:p>
+            <w:pPr>
+              <w:jc w:val="center"/>
+            </w:pPr>
             <w:r>
               <w:rPr>
                 <w:rFonts w:ascii="Calibri" w:hAnsi="Calibri"/>
                 <w:b/>
                 <w:color w:val="16A34A"/>
-                <w:sz w:val="18"/>
+                <w:sz w:val="16"/>
               </w:rPr>
               <w:t>PASS</w:t>
             </w:r>
@@ -713,23 +788,29 @@
         </w:tc>
       </w:tr>
       <w:tr>
+        <w:trPr>
+          <w:cantSplit/>
+        </w:trPr>
         <w:tc>
           <w:tcPr>
-            <w:tcW w:type="dxa" w:w="2074"/>
+            <w:tcW w:type="dxa" w:w="1080"/>
             <w:shd w:fill="F8FAFC"/>
             <w:tcMar>
-              <w:top w:w="50" w:type="dxa"/>
-              <w:bottom w:w="50" w:type="dxa"/>
-              <w:left w:w="70" w:type="dxa"/>
-              <w:right w:w="70" w:type="dxa"/>
+              <w:top w:w="30" w:type="dxa"/>
+              <w:bottom w:w="30" w:type="dxa"/>
+              <w:left w:w="40" w:type="dxa"/>
+              <w:right w:w="40" w:type="dxa"/>
             </w:tcMar>
           </w:tcPr>
           <w:p>
+            <w:pPr>
+              <w:jc w:val="center"/>
+            </w:pPr>
             <w:r>
               <w:rPr>
                 <w:rFonts w:ascii="Calibri" w:hAnsi="Calibri"/>
                 <w:color w:val="1E293B"/>
-                <w:sz w:val="18"/>
+                <w:sz w:val="16"/>
               </w:rPr>
               <w:t>TC-03</w:t>
             </w:r>
@@ -737,21 +818,24 @@
         </w:tc>
         <w:tc>
           <w:tcPr>
-            <w:tcW w:type="dxa" w:w="2074"/>
+            <w:tcW w:type="dxa" w:w="1152"/>
             <w:shd w:fill="F8FAFC"/>
             <w:tcMar>
-              <w:top w:w="50" w:type="dxa"/>
-              <w:bottom w:w="50" w:type="dxa"/>
-              <w:left w:w="70" w:type="dxa"/>
-              <w:right w:w="70" w:type="dxa"/>
+              <w:top w:w="30" w:type="dxa"/>
+              <w:bottom w:w="30" w:type="dxa"/>
+              <w:left w:w="40" w:type="dxa"/>
+              <w:right w:w="40" w:type="dxa"/>
             </w:tcMar>
           </w:tcPr>
           <w:p>
+            <w:pPr>
+              <w:jc w:val="center"/>
+            </w:pPr>
             <w:r>
               <w:rPr>
                 <w:rFonts w:ascii="Calibri" w:hAnsi="Calibri"/>
                 <w:color w:val="1E293B"/>
-                <w:sz w:val="18"/>
+                <w:sz w:val="16"/>
               </w:rPr>
               <w:t>Valid</w:t>
             </w:r>
@@ -759,66 +843,75 @@
         </w:tc>
         <w:tc>
           <w:tcPr>
-            <w:tcW w:type="dxa" w:w="2074"/>
+            <w:tcW w:type="dxa" w:w="3744"/>
             <w:shd w:fill="F8FAFC"/>
             <w:tcMar>
-              <w:top w:w="50" w:type="dxa"/>
-              <w:bottom w:w="50" w:type="dxa"/>
-              <w:left w:w="70" w:type="dxa"/>
-              <w:right w:w="70" w:type="dxa"/>
+              <w:top w:w="30" w:type="dxa"/>
+              <w:bottom w:w="30" w:type="dxa"/>
+              <w:left w:w="40" w:type="dxa"/>
+              <w:right w:w="40" w:type="dxa"/>
             </w:tcMar>
           </w:tcPr>
           <w:p>
+            <w:pPr>
+              <w:jc w:val="left"/>
+            </w:pPr>
             <w:r>
               <w:rPr>
                 <w:rFonts w:ascii="Calibri" w:hAnsi="Calibri"/>
                 <w:color w:val="1E293B"/>
-                <w:sz w:val="18"/>
+                <w:sz w:val="16"/>
               </w:rPr>
-              <w:t>Public query of valid Certificate ID</w:t>
+              <w:t>Authorized issuer mints cert (CERT-2026-CSE-001)</w:t>
             </w:r>
           </w:p>
         </w:tc>
         <w:tc>
           <w:tcPr>
-            <w:tcW w:type="dxa" w:w="2074"/>
+            <w:tcW w:type="dxa" w:w="3528"/>
             <w:shd w:fill="F8FAFC"/>
             <w:tcMar>
-              <w:top w:w="50" w:type="dxa"/>
-              <w:bottom w:w="50" w:type="dxa"/>
-              <w:left w:w="70" w:type="dxa"/>
-              <w:right w:w="70" w:type="dxa"/>
+              <w:top w:w="30" w:type="dxa"/>
+              <w:bottom w:w="30" w:type="dxa"/>
+              <w:left w:w="40" w:type="dxa"/>
+              <w:right w:w="40" w:type="dxa"/>
             </w:tcMar>
           </w:tcPr>
           <w:p>
+            <w:pPr>
+              <w:jc w:val="left"/>
+            </w:pPr>
             <w:r>
               <w:rPr>
                 <w:rFonts w:ascii="Calibri" w:hAnsi="Calibri"/>
-                <w:color w:val="1E293B"/>
-                <w:sz w:val="18"/>
+                <w:color w:val="2563EB"/>
+                <w:sz w:val="16"/>
               </w:rPr>
-              <w:t>Returns student details with Authentic badge</w:t>
+              <w:t>Tx: 0x5edfccba... | Gas: 280,516 gas</w:t>
             </w:r>
           </w:p>
         </w:tc>
         <w:tc>
           <w:tcPr>
-            <w:tcW w:type="dxa" w:w="2074"/>
+            <w:tcW w:type="dxa" w:w="864"/>
             <w:shd w:fill="F8FAFC"/>
             <w:tcMar>
-              <w:top w:w="50" w:type="dxa"/>
-              <w:bottom w:w="50" w:type="dxa"/>
-              <w:left w:w="70" w:type="dxa"/>
-              <w:right w:w="70" w:type="dxa"/>
+              <w:top w:w="30" w:type="dxa"/>
+              <w:bottom w:w="30" w:type="dxa"/>
+              <w:left w:w="40" w:type="dxa"/>
+              <w:right w:w="40" w:type="dxa"/>
             </w:tcMar>
           </w:tcPr>
           <w:p>
+            <w:pPr>
+              <w:jc w:val="center"/>
+            </w:pPr>
             <w:r>
               <w:rPr>
                 <w:rFonts w:ascii="Calibri" w:hAnsi="Calibri"/>
                 <w:b/>
                 <w:color w:val="16A34A"/>
-                <w:sz w:val="18"/>
+                <w:sz w:val="16"/>
               </w:rPr>
               <w:t>PASS</w:t>
             </w:r>
@@ -826,23 +919,29 @@
         </w:tc>
       </w:tr>
       <w:tr>
+        <w:trPr>
+          <w:cantSplit/>
+        </w:trPr>
         <w:tc>
           <w:tcPr>
-            <w:tcW w:type="dxa" w:w="2074"/>
+            <w:tcW w:type="dxa" w:w="1080"/>
             <w:shd w:fill="FFFFFF"/>
             <w:tcMar>
-              <w:top w:w="50" w:type="dxa"/>
-              <w:bottom w:w="50" w:type="dxa"/>
-              <w:left w:w="70" w:type="dxa"/>
-              <w:right w:w="70" w:type="dxa"/>
+              <w:top w:w="30" w:type="dxa"/>
+              <w:bottom w:w="30" w:type="dxa"/>
+              <w:left w:w="40" w:type="dxa"/>
+              <w:right w:w="40" w:type="dxa"/>
             </w:tcMar>
           </w:tcPr>
           <w:p>
+            <w:pPr>
+              <w:jc w:val="center"/>
+            </w:pPr>
             <w:r>
               <w:rPr>
                 <w:rFonts w:ascii="Calibri" w:hAnsi="Calibri"/>
                 <w:color w:val="1E293B"/>
-                <w:sz w:val="18"/>
+                <w:sz w:val="16"/>
               </w:rPr>
               <w:t>TC-04</w:t>
             </w:r>
@@ -850,65 +949,336 @@
         </w:tc>
         <w:tc>
           <w:tcPr>
-            <w:tcW w:type="dxa" w:w="2074"/>
+            <w:tcW w:type="dxa" w:w="1152"/>
             <w:shd w:fill="FFFFFF"/>
             <w:tcMar>
-              <w:top w:w="50" w:type="dxa"/>
-              <w:bottom w:w="50" w:type="dxa"/>
-              <w:left w:w="70" w:type="dxa"/>
-              <w:right w:w="70" w:type="dxa"/>
+              <w:top w:w="30" w:type="dxa"/>
+              <w:bottom w:w="30" w:type="dxa"/>
+              <w:left w:w="40" w:type="dxa"/>
+              <w:right w:w="40" w:type="dxa"/>
             </w:tcMar>
           </w:tcPr>
           <w:p>
+            <w:pPr>
+              <w:jc w:val="center"/>
+            </w:pPr>
             <w:r>
               <w:rPr>
                 <w:rFonts w:ascii="Calibri" w:hAnsi="Calibri"/>
                 <w:color w:val="1E293B"/>
-                <w:sz w:val="18"/>
+                <w:sz w:val="16"/>
               </w:rPr>
-              <w:t>Invalid Input</w:t>
+              <w:t>Valid</w:t>
             </w:r>
           </w:p>
         </w:tc>
         <w:tc>
           <w:tcPr>
-            <w:tcW w:type="dxa" w:w="2074"/>
+            <w:tcW w:type="dxa" w:w="3744"/>
             <w:shd w:fill="FFFFFF"/>
             <w:tcMar>
-              <w:top w:w="50" w:type="dxa"/>
-              <w:bottom w:w="50" w:type="dxa"/>
-              <w:left w:w="70" w:type="dxa"/>
-              <w:right w:w="70" w:type="dxa"/>
+              <w:top w:w="30" w:type="dxa"/>
+              <w:bottom w:w="30" w:type="dxa"/>
+              <w:left w:w="40" w:type="dxa"/>
+              <w:right w:w="40" w:type="dxa"/>
             </w:tcMar>
           </w:tcPr>
           <w:p>
+            <w:pPr>
+              <w:jc w:val="left"/>
+            </w:pPr>
             <w:r>
               <w:rPr>
                 <w:rFonts w:ascii="Calibri" w:hAnsi="Calibri"/>
                 <w:color w:val="1E293B"/>
-                <w:sz w:val="18"/>
+                <w:sz w:val="16"/>
               </w:rPr>
-              <w:t>Issue certificate with empty student name ("")</w:t>
+              <w:t>Public query of valid Certificate ID from EVM storage</w:t>
             </w:r>
           </w:p>
         </w:tc>
         <w:tc>
           <w:tcPr>
-            <w:tcW w:type="dxa" w:w="2074"/>
+            <w:tcW w:type="dxa" w:w="3528"/>
             <w:shd w:fill="FFFFFF"/>
             <w:tcMar>
-              <w:top w:w="50" w:type="dxa"/>
-              <w:bottom w:w="50" w:type="dxa"/>
-              <w:left w:w="70" w:type="dxa"/>
-              <w:right w:w="70" w:type="dxa"/>
+              <w:top w:w="30" w:type="dxa"/>
+              <w:bottom w:w="30" w:type="dxa"/>
+              <w:left w:w="40" w:type="dxa"/>
+              <w:right w:w="40" w:type="dxa"/>
             </w:tcMar>
           </w:tcPr>
           <w:p>
+            <w:pPr>
+              <w:jc w:val="left"/>
+            </w:pPr>
+            <w:r>
+              <w:rPr>
+                <w:rFonts w:ascii="Calibri" w:hAnsi="Calibri"/>
+                <w:color w:val="1E293B"/>
+                <w:sz w:val="16"/>
+              </w:rPr>
+              <w:t>Returns verified record: Soham Sandeep Pawar (230905312)</w:t>
+            </w:r>
+          </w:p>
+        </w:tc>
+        <w:tc>
+          <w:tcPr>
+            <w:tcW w:type="dxa" w:w="864"/>
+            <w:shd w:fill="FFFFFF"/>
+            <w:tcMar>
+              <w:top w:w="30" w:type="dxa"/>
+              <w:bottom w:w="30" w:type="dxa"/>
+              <w:left w:w="40" w:type="dxa"/>
+              <w:right w:w="40" w:type="dxa"/>
+            </w:tcMar>
+          </w:tcPr>
+          <w:p>
+            <w:pPr>
+              <w:jc w:val="center"/>
+            </w:pPr>
+            <w:r>
+              <w:rPr>
+                <w:rFonts w:ascii="Calibri" w:hAnsi="Calibri"/>
+                <w:b/>
+                <w:color w:val="16A34A"/>
+                <w:sz w:val="16"/>
+              </w:rPr>
+              <w:t>PASS</w:t>
+            </w:r>
+          </w:p>
+        </w:tc>
+      </w:tr>
+      <w:tr>
+        <w:trPr>
+          <w:cantSplit/>
+        </w:trPr>
+        <w:tc>
+          <w:tcPr>
+            <w:tcW w:type="dxa" w:w="1080"/>
+            <w:shd w:fill="F8FAFC"/>
+            <w:tcMar>
+              <w:top w:w="30" w:type="dxa"/>
+              <w:bottom w:w="30" w:type="dxa"/>
+              <w:left w:w="40" w:type="dxa"/>
+              <w:right w:w="40" w:type="dxa"/>
+            </w:tcMar>
+          </w:tcPr>
+          <w:p>
+            <w:pPr>
+              <w:jc w:val="center"/>
+            </w:pPr>
+            <w:r>
+              <w:rPr>
+                <w:rFonts w:ascii="Calibri" w:hAnsi="Calibri"/>
+                <w:color w:val="1E293B"/>
+                <w:sz w:val="16"/>
+              </w:rPr>
+              <w:t>TC-05</w:t>
+            </w:r>
+          </w:p>
+        </w:tc>
+        <w:tc>
+          <w:tcPr>
+            <w:tcW w:type="dxa" w:w="1152"/>
+            <w:shd w:fill="F8FAFC"/>
+            <w:tcMar>
+              <w:top w:w="30" w:type="dxa"/>
+              <w:bottom w:w="30" w:type="dxa"/>
+              <w:left w:w="40" w:type="dxa"/>
+              <w:right w:w="40" w:type="dxa"/>
+            </w:tcMar>
+          </w:tcPr>
+          <w:p>
+            <w:pPr>
+              <w:jc w:val="center"/>
+            </w:pPr>
+            <w:r>
+              <w:rPr>
+                <w:rFonts w:ascii="Calibri" w:hAnsi="Calibri"/>
+                <w:color w:val="1E293B"/>
+                <w:sz w:val="16"/>
+              </w:rPr>
+              <w:t>Valid</w:t>
+            </w:r>
+          </w:p>
+        </w:tc>
+        <w:tc>
+          <w:tcPr>
+            <w:tcW w:type="dxa" w:w="3744"/>
+            <w:shd w:fill="F8FAFC"/>
+            <w:tcMar>
+              <w:top w:w="30" w:type="dxa"/>
+              <w:bottom w:w="30" w:type="dxa"/>
+              <w:left w:w="40" w:type="dxa"/>
+              <w:right w:w="40" w:type="dxa"/>
+            </w:tcMar>
+          </w:tcPr>
+          <w:p>
+            <w:pPr>
+              <w:jc w:val="left"/>
+            </w:pPr>
+            <w:r>
+              <w:rPr>
+                <w:rFonts w:ascii="Calibri" w:hAnsi="Calibri"/>
+                <w:color w:val="1E293B"/>
+                <w:sz w:val="16"/>
+              </w:rPr>
+              <w:t>Department revokes certificate with valid reason</w:t>
+            </w:r>
+          </w:p>
+        </w:tc>
+        <w:tc>
+          <w:tcPr>
+            <w:tcW w:type="dxa" w:w="3528"/>
+            <w:shd w:fill="F8FAFC"/>
+            <w:tcMar>
+              <w:top w:w="30" w:type="dxa"/>
+              <w:bottom w:w="30" w:type="dxa"/>
+              <w:left w:w="40" w:type="dxa"/>
+              <w:right w:w="40" w:type="dxa"/>
+            </w:tcMar>
+          </w:tcPr>
+          <w:p>
+            <w:pPr>
+              <w:jc w:val="left"/>
+            </w:pPr>
+            <w:r>
+              <w:rPr>
+                <w:rFonts w:ascii="Calibri" w:hAnsi="Calibri"/>
+                <w:color w:val="2563EB"/>
+                <w:sz w:val="16"/>
+              </w:rPr>
+              <w:t>Tx: 0x3160e362... | isRevoked set to true</w:t>
+            </w:r>
+          </w:p>
+        </w:tc>
+        <w:tc>
+          <w:tcPr>
+            <w:tcW w:type="dxa" w:w="864"/>
+            <w:shd w:fill="F8FAFC"/>
+            <w:tcMar>
+              <w:top w:w="30" w:type="dxa"/>
+              <w:bottom w:w="30" w:type="dxa"/>
+              <w:left w:w="40" w:type="dxa"/>
+              <w:right w:w="40" w:type="dxa"/>
+            </w:tcMar>
+          </w:tcPr>
+          <w:p>
+            <w:pPr>
+              <w:jc w:val="center"/>
+            </w:pPr>
+            <w:r>
+              <w:rPr>
+                <w:rFonts w:ascii="Calibri" w:hAnsi="Calibri"/>
+                <w:b/>
+                <w:color w:val="16A34A"/>
+                <w:sz w:val="16"/>
+              </w:rPr>
+              <w:t>PASS</w:t>
+            </w:r>
+          </w:p>
+        </w:tc>
+      </w:tr>
+      <w:tr>
+        <w:trPr>
+          <w:cantSplit/>
+        </w:trPr>
+        <w:tc>
+          <w:tcPr>
+            <w:tcW w:type="dxa" w:w="1080"/>
+            <w:shd w:fill="FFFFFF"/>
+            <w:tcMar>
+              <w:top w:w="30" w:type="dxa"/>
+              <w:bottom w:w="30" w:type="dxa"/>
+              <w:left w:w="40" w:type="dxa"/>
+              <w:right w:w="40" w:type="dxa"/>
+            </w:tcMar>
+          </w:tcPr>
+          <w:p>
+            <w:pPr>
+              <w:jc w:val="center"/>
+            </w:pPr>
+            <w:r>
+              <w:rPr>
+                <w:rFonts w:ascii="Calibri" w:hAnsi="Calibri"/>
+                <w:color w:val="1E293B"/>
+                <w:sz w:val="16"/>
+              </w:rPr>
+              <w:t>TC-06</w:t>
+            </w:r>
+          </w:p>
+        </w:tc>
+        <w:tc>
+          <w:tcPr>
+            <w:tcW w:type="dxa" w:w="1152"/>
+            <w:shd w:fill="FFFFFF"/>
+            <w:tcMar>
+              <w:top w:w="30" w:type="dxa"/>
+              <w:bottom w:w="30" w:type="dxa"/>
+              <w:left w:w="40" w:type="dxa"/>
+              <w:right w:w="40" w:type="dxa"/>
+            </w:tcMar>
+          </w:tcPr>
+          <w:p>
+            <w:pPr>
+              <w:jc w:val="center"/>
+            </w:pPr>
+            <w:r>
+              <w:rPr>
+                <w:rFonts w:ascii="Calibri" w:hAnsi="Calibri"/>
+                <w:color w:val="1E293B"/>
+                <w:sz w:val="16"/>
+              </w:rPr>
+              <w:t>Invalid</w:t>
+            </w:r>
+          </w:p>
+        </w:tc>
+        <w:tc>
+          <w:tcPr>
+            <w:tcW w:type="dxa" w:w="3744"/>
+            <w:shd w:fill="FFFFFF"/>
+            <w:tcMar>
+              <w:top w:w="30" w:type="dxa"/>
+              <w:bottom w:w="30" w:type="dxa"/>
+              <w:left w:w="40" w:type="dxa"/>
+              <w:right w:w="40" w:type="dxa"/>
+            </w:tcMar>
+          </w:tcPr>
+          <w:p>
+            <w:pPr>
+              <w:jc w:val="left"/>
+            </w:pPr>
+            <w:r>
+              <w:rPr>
+                <w:rFonts w:ascii="Calibri" w:hAnsi="Calibri"/>
+                <w:color w:val="1E293B"/>
+                <w:sz w:val="16"/>
+              </w:rPr>
+              <w:t>Issue certificate with empty student name string ("")</w:t>
+            </w:r>
+          </w:p>
+        </w:tc>
+        <w:tc>
+          <w:tcPr>
+            <w:tcW w:type="dxa" w:w="3528"/>
+            <w:shd w:fill="FFFFFF"/>
+            <w:tcMar>
+              <w:top w:w="30" w:type="dxa"/>
+              <w:bottom w:w="30" w:type="dxa"/>
+              <w:left w:w="40" w:type="dxa"/>
+              <w:right w:w="40" w:type="dxa"/>
+            </w:tcMar>
+          </w:tcPr>
+          <w:p>
+            <w:pPr>
+              <w:jc w:val="left"/>
+            </w:pPr>
             <w:r>
               <w:rPr>
                 <w:rFonts w:ascii="Calibri" w:hAnsi="Calibri"/>
                 <w:color w:val="DC2626"/>
-                <w:sz w:val="18"/>
+                <w:sz w:val="16"/>
               </w:rPr>
               <w:t>EVM Revert: 'Student name cannot be empty'</w:t>
             </w:r>
@@ -916,22 +1286,25 @@
         </w:tc>
         <w:tc>
           <w:tcPr>
-            <w:tcW w:type="dxa" w:w="2074"/>
+            <w:tcW w:type="dxa" w:w="864"/>
             <w:shd w:fill="FFFFFF"/>
             <w:tcMar>
-              <w:top w:w="50" w:type="dxa"/>
-              <w:bottom w:w="50" w:type="dxa"/>
-              <w:left w:w="70" w:type="dxa"/>
-              <w:right w:w="70" w:type="dxa"/>
+              <w:top w:w="30" w:type="dxa"/>
+              <w:bottom w:w="30" w:type="dxa"/>
+              <w:left w:w="40" w:type="dxa"/>
+              <w:right w:w="40" w:type="dxa"/>
             </w:tcMar>
           </w:tcPr>
           <w:p>
+            <w:pPr>
+              <w:jc w:val="center"/>
+            </w:pPr>
             <w:r>
               <w:rPr>
                 <w:rFonts w:ascii="Calibri" w:hAnsi="Calibri"/>
                 <w:b/>
                 <w:color w:val="16A34A"/>
-                <w:sz w:val="18"/>
+                <w:sz w:val="16"/>
               </w:rPr>
               <w:t>PASS</w:t>
             </w:r>
@@ -939,89 +1312,104 @@
         </w:tc>
       </w:tr>
       <w:tr>
+        <w:trPr>
+          <w:cantSplit/>
+        </w:trPr>
         <w:tc>
           <w:tcPr>
-            <w:tcW w:type="dxa" w:w="2074"/>
+            <w:tcW w:type="dxa" w:w="1080"/>
             <w:shd w:fill="F8FAFC"/>
             <w:tcMar>
-              <w:top w:w="50" w:type="dxa"/>
-              <w:bottom w:w="50" w:type="dxa"/>
-              <w:left w:w="70" w:type="dxa"/>
-              <w:right w:w="70" w:type="dxa"/>
+              <w:top w:w="30" w:type="dxa"/>
+              <w:bottom w:w="30" w:type="dxa"/>
+              <w:left w:w="40" w:type="dxa"/>
+              <w:right w:w="40" w:type="dxa"/>
             </w:tcMar>
           </w:tcPr>
           <w:p>
+            <w:pPr>
+              <w:jc w:val="center"/>
+            </w:pPr>
             <w:r>
               <w:rPr>
                 <w:rFonts w:ascii="Calibri" w:hAnsi="Calibri"/>
                 <w:color w:val="1E293B"/>
-                <w:sz w:val="18"/>
+                <w:sz w:val="16"/>
               </w:rPr>
-              <w:t>TC-05</w:t>
+              <w:t>TC-07</w:t>
             </w:r>
           </w:p>
         </w:tc>
         <w:tc>
           <w:tcPr>
-            <w:tcW w:type="dxa" w:w="2074"/>
+            <w:tcW w:type="dxa" w:w="1152"/>
             <w:shd w:fill="F8FAFC"/>
             <w:tcMar>
-              <w:top w:w="50" w:type="dxa"/>
-              <w:bottom w:w="50" w:type="dxa"/>
-              <w:left w:w="70" w:type="dxa"/>
-              <w:right w:w="70" w:type="dxa"/>
+              <w:top w:w="30" w:type="dxa"/>
+              <w:bottom w:w="30" w:type="dxa"/>
+              <w:left w:w="40" w:type="dxa"/>
+              <w:right w:w="40" w:type="dxa"/>
             </w:tcMar>
           </w:tcPr>
           <w:p>
+            <w:pPr>
+              <w:jc w:val="center"/>
+            </w:pPr>
             <w:r>
               <w:rPr>
                 <w:rFonts w:ascii="Calibri" w:hAnsi="Calibri"/>
                 <w:color w:val="1E293B"/>
-                <w:sz w:val="18"/>
+                <w:sz w:val="16"/>
               </w:rPr>
-              <w:t>Invalid Input</w:t>
+              <w:t>Invalid</w:t>
             </w:r>
           </w:p>
         </w:tc>
         <w:tc>
           <w:tcPr>
-            <w:tcW w:type="dxa" w:w="2074"/>
+            <w:tcW w:type="dxa" w:w="3744"/>
             <w:shd w:fill="F8FAFC"/>
             <w:tcMar>
-              <w:top w:w="50" w:type="dxa"/>
-              <w:bottom w:w="50" w:type="dxa"/>
-              <w:left w:w="70" w:type="dxa"/>
-              <w:right w:w="70" w:type="dxa"/>
+              <w:top w:w="30" w:type="dxa"/>
+              <w:bottom w:w="30" w:type="dxa"/>
+              <w:left w:w="40" w:type="dxa"/>
+              <w:right w:w="40" w:type="dxa"/>
             </w:tcMar>
           </w:tcPr>
           <w:p>
+            <w:pPr>
+              <w:jc w:val="left"/>
+            </w:pPr>
             <w:r>
               <w:rPr>
                 <w:rFonts w:ascii="Calibri" w:hAnsi="Calibri"/>
                 <w:color w:val="1E293B"/>
-                <w:sz w:val="18"/>
+                <w:sz w:val="16"/>
               </w:rPr>
-              <w:t>Issue certificate with duplicate ID</w:t>
+              <w:t>Issue certificate with duplicate Certificate ID</w:t>
             </w:r>
           </w:p>
         </w:tc>
         <w:tc>
           <w:tcPr>
-            <w:tcW w:type="dxa" w:w="2074"/>
+            <w:tcW w:type="dxa" w:w="3528"/>
             <w:shd w:fill="F8FAFC"/>
             <w:tcMar>
-              <w:top w:w="50" w:type="dxa"/>
-              <w:bottom w:w="50" w:type="dxa"/>
-              <w:left w:w="70" w:type="dxa"/>
-              <w:right w:w="70" w:type="dxa"/>
+              <w:top w:w="30" w:type="dxa"/>
+              <w:bottom w:w="30" w:type="dxa"/>
+              <w:left w:w="40" w:type="dxa"/>
+              <w:right w:w="40" w:type="dxa"/>
             </w:tcMar>
           </w:tcPr>
           <w:p>
+            <w:pPr>
+              <w:jc w:val="left"/>
+            </w:pPr>
             <w:r>
               <w:rPr>
                 <w:rFonts w:ascii="Calibri" w:hAnsi="Calibri"/>
                 <w:color w:val="DC2626"/>
-                <w:sz w:val="18"/>
+                <w:sz w:val="16"/>
               </w:rPr>
               <w:t>EVM Revert: 'Certificate with this ID already exists'</w:t>
             </w:r>
@@ -1029,22 +1417,25 @@
         </w:tc>
         <w:tc>
           <w:tcPr>
-            <w:tcW w:type="dxa" w:w="2074"/>
+            <w:tcW w:type="dxa" w:w="864"/>
             <w:shd w:fill="F8FAFC"/>
             <w:tcMar>
-              <w:top w:w="50" w:type="dxa"/>
-              <w:bottom w:w="50" w:type="dxa"/>
-              <w:left w:w="70" w:type="dxa"/>
-              <w:right w:w="70" w:type="dxa"/>
+              <w:top w:w="30" w:type="dxa"/>
+              <w:bottom w:w="30" w:type="dxa"/>
+              <w:left w:w="40" w:type="dxa"/>
+              <w:right w:w="40" w:type="dxa"/>
             </w:tcMar>
           </w:tcPr>
           <w:p>
+            <w:pPr>
+              <w:jc w:val="center"/>
+            </w:pPr>
             <w:r>
               <w:rPr>
                 <w:rFonts w:ascii="Calibri" w:hAnsi="Calibri"/>
                 <w:b/>
                 <w:color w:val="16A34A"/>
-                <w:sz w:val="18"/>
+                <w:sz w:val="16"/>
               </w:rPr>
               <w:t>PASS</w:t>
             </w:r>
@@ -1052,67 +1443,341 @@
         </w:tc>
       </w:tr>
       <w:tr>
+        <w:trPr>
+          <w:cantSplit/>
+        </w:trPr>
         <w:tc>
           <w:tcPr>
-            <w:tcW w:type="dxa" w:w="2074"/>
+            <w:tcW w:type="dxa" w:w="1080"/>
             <w:shd w:fill="FFFFFF"/>
             <w:tcMar>
-              <w:top w:w="50" w:type="dxa"/>
-              <w:bottom w:w="50" w:type="dxa"/>
-              <w:left w:w="70" w:type="dxa"/>
-              <w:right w:w="70" w:type="dxa"/>
+              <w:top w:w="30" w:type="dxa"/>
+              <w:bottom w:w="30" w:type="dxa"/>
+              <w:left w:w="40" w:type="dxa"/>
+              <w:right w:w="40" w:type="dxa"/>
             </w:tcMar>
           </w:tcPr>
           <w:p>
+            <w:pPr>
+              <w:jc w:val="center"/>
+            </w:pPr>
             <w:r>
               <w:rPr>
                 <w:rFonts w:ascii="Calibri" w:hAnsi="Calibri"/>
                 <w:color w:val="1E293B"/>
-                <w:sz w:val="18"/>
+                <w:sz w:val="16"/>
               </w:rPr>
-              <w:t>TC-06</w:t>
+              <w:t>TC-08</w:t>
             </w:r>
           </w:p>
         </w:tc>
         <w:tc>
           <w:tcPr>
-            <w:tcW w:type="dxa" w:w="2074"/>
+            <w:tcW w:type="dxa" w:w="1152"/>
             <w:shd w:fill="FFFFFF"/>
             <w:tcMar>
-              <w:top w:w="50" w:type="dxa"/>
-              <w:bottom w:w="50" w:type="dxa"/>
-              <w:left w:w="70" w:type="dxa"/>
-              <w:right w:w="70" w:type="dxa"/>
+              <w:top w:w="30" w:type="dxa"/>
+              <w:bottom w:w="30" w:type="dxa"/>
+              <w:left w:w="40" w:type="dxa"/>
+              <w:right w:w="40" w:type="dxa"/>
             </w:tcMar>
           </w:tcPr>
           <w:p>
+            <w:pPr>
+              <w:jc w:val="center"/>
+            </w:pPr>
             <w:r>
               <w:rPr>
                 <w:rFonts w:ascii="Calibri" w:hAnsi="Calibri"/>
                 <w:color w:val="1E293B"/>
-                <w:sz w:val="18"/>
+                <w:sz w:val="16"/>
               </w:rPr>
-              <w:t>Unauthorised</w:t>
+              <w:t>Invalid</w:t>
             </w:r>
           </w:p>
         </w:tc>
         <w:tc>
           <w:tcPr>
-            <w:tcW w:type="dxa" w:w="2074"/>
+            <w:tcW w:type="dxa" w:w="3744"/>
             <w:shd w:fill="FFFFFF"/>
             <w:tcMar>
-              <w:top w:w="50" w:type="dxa"/>
-              <w:bottom w:w="50" w:type="dxa"/>
-              <w:left w:w="70" w:type="dxa"/>
-              <w:right w:w="70" w:type="dxa"/>
+              <w:top w:w="30" w:type="dxa"/>
+              <w:bottom w:w="30" w:type="dxa"/>
+              <w:left w:w="40" w:type="dxa"/>
+              <w:right w:w="40" w:type="dxa"/>
             </w:tcMar>
           </w:tcPr>
           <w:p>
+            <w:pPr>
+              <w:jc w:val="left"/>
+            </w:pPr>
             <w:r>
               <w:rPr>
                 <w:rFonts w:ascii="Calibri" w:hAnsi="Calibri"/>
                 <w:color w:val="1E293B"/>
-                <w:sz w:val="18"/>
+                <w:sz w:val="16"/>
+              </w:rPr>
+              <w:t>Query non-existent Certificate ID</w:t>
+            </w:r>
+          </w:p>
+        </w:tc>
+        <w:tc>
+          <w:tcPr>
+            <w:tcW w:type="dxa" w:w="3528"/>
+            <w:shd w:fill="FFFFFF"/>
+            <w:tcMar>
+              <w:top w:w="30" w:type="dxa"/>
+              <w:bottom w:w="30" w:type="dxa"/>
+              <w:left w:w="40" w:type="dxa"/>
+              <w:right w:w="40" w:type="dxa"/>
+            </w:tcMar>
+          </w:tcPr>
+          <w:p>
+            <w:pPr>
+              <w:jc w:val="left"/>
+            </w:pPr>
+            <w:r>
+              <w:rPr>
+                <w:rFonts w:ascii="Calibri" w:hAnsi="Calibri"/>
+                <w:color w:val="1E293B"/>
+                <w:sz w:val="16"/>
+              </w:rPr>
+              <w:t>Returns exists: false gracefully without EVM failure</w:t>
+            </w:r>
+          </w:p>
+        </w:tc>
+        <w:tc>
+          <w:tcPr>
+            <w:tcW w:type="dxa" w:w="864"/>
+            <w:shd w:fill="FFFFFF"/>
+            <w:tcMar>
+              <w:top w:w="30" w:type="dxa"/>
+              <w:bottom w:w="30" w:type="dxa"/>
+              <w:left w:w="40" w:type="dxa"/>
+              <w:right w:w="40" w:type="dxa"/>
+            </w:tcMar>
+          </w:tcPr>
+          <w:p>
+            <w:pPr>
+              <w:jc w:val="center"/>
+            </w:pPr>
+            <w:r>
+              <w:rPr>
+                <w:rFonts w:ascii="Calibri" w:hAnsi="Calibri"/>
+                <w:b/>
+                <w:color w:val="16A34A"/>
+                <w:sz w:val="16"/>
+              </w:rPr>
+              <w:t>PASS</w:t>
+            </w:r>
+          </w:p>
+        </w:tc>
+      </w:tr>
+      <w:tr>
+        <w:trPr>
+          <w:cantSplit/>
+        </w:trPr>
+        <w:tc>
+          <w:tcPr>
+            <w:tcW w:type="dxa" w:w="1080"/>
+            <w:shd w:fill="F8FAFC"/>
+            <w:tcMar>
+              <w:top w:w="30" w:type="dxa"/>
+              <w:bottom w:w="30" w:type="dxa"/>
+              <w:left w:w="40" w:type="dxa"/>
+              <w:right w:w="40" w:type="dxa"/>
+            </w:tcMar>
+          </w:tcPr>
+          <w:p>
+            <w:pPr>
+              <w:jc w:val="center"/>
+            </w:pPr>
+            <w:r>
+              <w:rPr>
+                <w:rFonts w:ascii="Calibri" w:hAnsi="Calibri"/>
+                <w:color w:val="1E293B"/>
+                <w:sz w:val="16"/>
+              </w:rPr>
+              <w:t>TC-09</w:t>
+            </w:r>
+          </w:p>
+        </w:tc>
+        <w:tc>
+          <w:tcPr>
+            <w:tcW w:type="dxa" w:w="1152"/>
+            <w:shd w:fill="F8FAFC"/>
+            <w:tcMar>
+              <w:top w:w="30" w:type="dxa"/>
+              <w:bottom w:w="30" w:type="dxa"/>
+              <w:left w:w="40" w:type="dxa"/>
+              <w:right w:w="40" w:type="dxa"/>
+            </w:tcMar>
+          </w:tcPr>
+          <w:p>
+            <w:pPr>
+              <w:jc w:val="center"/>
+            </w:pPr>
+            <w:r>
+              <w:rPr>
+                <w:rFonts w:ascii="Calibri" w:hAnsi="Calibri"/>
+                <w:color w:val="1E293B"/>
+                <w:sz w:val="16"/>
+              </w:rPr>
+              <w:t>Invalid</w:t>
+            </w:r>
+          </w:p>
+        </w:tc>
+        <w:tc>
+          <w:tcPr>
+            <w:tcW w:type="dxa" w:w="3744"/>
+            <w:shd w:fill="F8FAFC"/>
+            <w:tcMar>
+              <w:top w:w="30" w:type="dxa"/>
+              <w:bottom w:w="30" w:type="dxa"/>
+              <w:left w:w="40" w:type="dxa"/>
+              <w:right w:w="40" w:type="dxa"/>
+            </w:tcMar>
+          </w:tcPr>
+          <w:p>
+            <w:pPr>
+              <w:jc w:val="left"/>
+            </w:pPr>
+            <w:r>
+              <w:rPr>
+                <w:rFonts w:ascii="Calibri" w:hAnsi="Calibri"/>
+                <w:color w:val="1E293B"/>
+                <w:sz w:val="16"/>
+              </w:rPr>
+              <w:t>Revoke certificate with empty reason string ("")</w:t>
+            </w:r>
+          </w:p>
+        </w:tc>
+        <w:tc>
+          <w:tcPr>
+            <w:tcW w:type="dxa" w:w="3528"/>
+            <w:shd w:fill="F8FAFC"/>
+            <w:tcMar>
+              <w:top w:w="30" w:type="dxa"/>
+              <w:bottom w:w="30" w:type="dxa"/>
+              <w:left w:w="40" w:type="dxa"/>
+              <w:right w:w="40" w:type="dxa"/>
+            </w:tcMar>
+          </w:tcPr>
+          <w:p>
+            <w:pPr>
+              <w:jc w:val="left"/>
+            </w:pPr>
+            <w:r>
+              <w:rPr>
+                <w:rFonts w:ascii="Calibri" w:hAnsi="Calibri"/>
+                <w:color w:val="DC2626"/>
+                <w:sz w:val="16"/>
+              </w:rPr>
+              <w:t>EVM Revert: 'Revocation reason cannot be empty'</w:t>
+            </w:r>
+          </w:p>
+        </w:tc>
+        <w:tc>
+          <w:tcPr>
+            <w:tcW w:type="dxa" w:w="864"/>
+            <w:shd w:fill="F8FAFC"/>
+            <w:tcMar>
+              <w:top w:w="30" w:type="dxa"/>
+              <w:bottom w:w="30" w:type="dxa"/>
+              <w:left w:w="40" w:type="dxa"/>
+              <w:right w:w="40" w:type="dxa"/>
+            </w:tcMar>
+          </w:tcPr>
+          <w:p>
+            <w:pPr>
+              <w:jc w:val="center"/>
+            </w:pPr>
+            <w:r>
+              <w:rPr>
+                <w:rFonts w:ascii="Calibri" w:hAnsi="Calibri"/>
+                <w:b/>
+                <w:color w:val="16A34A"/>
+                <w:sz w:val="16"/>
+              </w:rPr>
+              <w:t>PASS</w:t>
+            </w:r>
+          </w:p>
+        </w:tc>
+      </w:tr>
+      <w:tr>
+        <w:trPr>
+          <w:cantSplit/>
+        </w:trPr>
+        <w:tc>
+          <w:tcPr>
+            <w:tcW w:type="dxa" w:w="1080"/>
+            <w:shd w:fill="FFFFFF"/>
+            <w:tcMar>
+              <w:top w:w="30" w:type="dxa"/>
+              <w:bottom w:w="30" w:type="dxa"/>
+              <w:left w:w="40" w:type="dxa"/>
+              <w:right w:w="40" w:type="dxa"/>
+            </w:tcMar>
+          </w:tcPr>
+          <w:p>
+            <w:pPr>
+              <w:jc w:val="center"/>
+            </w:pPr>
+            <w:r>
+              <w:rPr>
+                <w:rFonts w:ascii="Calibri" w:hAnsi="Calibri"/>
+                <w:color w:val="1E293B"/>
+                <w:sz w:val="16"/>
+              </w:rPr>
+              <w:t>TC-10</w:t>
+            </w:r>
+          </w:p>
+        </w:tc>
+        <w:tc>
+          <w:tcPr>
+            <w:tcW w:type="dxa" w:w="1152"/>
+            <w:shd w:fill="FFFFFF"/>
+            <w:tcMar>
+              <w:top w:w="30" w:type="dxa"/>
+              <w:bottom w:w="30" w:type="dxa"/>
+              <w:left w:w="40" w:type="dxa"/>
+              <w:right w:w="40" w:type="dxa"/>
+            </w:tcMar>
+          </w:tcPr>
+          <w:p>
+            <w:pPr>
+              <w:jc w:val="center"/>
+            </w:pPr>
+            <w:r>
+              <w:rPr>
+                <w:rFonts w:ascii="Calibri" w:hAnsi="Calibri"/>
+                <w:color w:val="1E293B"/>
+                <w:sz w:val="16"/>
+              </w:rPr>
+              <w:t>Unauth</w:t>
+            </w:r>
+          </w:p>
+        </w:tc>
+        <w:tc>
+          <w:tcPr>
+            <w:tcW w:type="dxa" w:w="3744"/>
+            <w:shd w:fill="FFFFFF"/>
+            <w:tcMar>
+              <w:top w:w="30" w:type="dxa"/>
+              <w:bottom w:w="30" w:type="dxa"/>
+              <w:left w:w="40" w:type="dxa"/>
+              <w:right w:w="40" w:type="dxa"/>
+            </w:tcMar>
+          </w:tcPr>
+          <w:p>
+            <w:pPr>
+              <w:jc w:val="left"/>
+            </w:pPr>
+            <w:r>
+              <w:rPr>
+                <w:rFonts w:ascii="Calibri" w:hAnsi="Calibri"/>
+                <w:color w:val="1E293B"/>
+                <w:sz w:val="16"/>
               </w:rPr>
               <w:t>Non-owner attempts to call addIssuer(...)</w:t>
             </w:r>
@@ -1120,21 +1785,24 @@
         </w:tc>
         <w:tc>
           <w:tcPr>
-            <w:tcW w:type="dxa" w:w="2074"/>
+            <w:tcW w:type="dxa" w:w="3528"/>
             <w:shd w:fill="FFFFFF"/>
             <w:tcMar>
-              <w:top w:w="50" w:type="dxa"/>
-              <w:bottom w:w="50" w:type="dxa"/>
-              <w:left w:w="70" w:type="dxa"/>
-              <w:right w:w="70" w:type="dxa"/>
+              <w:top w:w="30" w:type="dxa"/>
+              <w:bottom w:w="30" w:type="dxa"/>
+              <w:left w:w="40" w:type="dxa"/>
+              <w:right w:w="40" w:type="dxa"/>
             </w:tcMar>
           </w:tcPr>
           <w:p>
+            <w:pPr>
+              <w:jc w:val="left"/>
+            </w:pPr>
             <w:r>
               <w:rPr>
                 <w:rFonts w:ascii="Calibri" w:hAnsi="Calibri"/>
                 <w:color w:val="DC2626"/>
-                <w:sz w:val="18"/>
+                <w:sz w:val="16"/>
               </w:rPr>
               <w:t>EVM Revert: 'Caller is not the contract owner'</w:t>
             </w:r>
@@ -1142,22 +1810,287 @@
         </w:tc>
         <w:tc>
           <w:tcPr>
-            <w:tcW w:type="dxa" w:w="2074"/>
+            <w:tcW w:type="dxa" w:w="864"/>
             <w:shd w:fill="FFFFFF"/>
             <w:tcMar>
-              <w:top w:w="50" w:type="dxa"/>
-              <w:bottom w:w="50" w:type="dxa"/>
-              <w:left w:w="70" w:type="dxa"/>
-              <w:right w:w="70" w:type="dxa"/>
+              <w:top w:w="30" w:type="dxa"/>
+              <w:bottom w:w="30" w:type="dxa"/>
+              <w:left w:w="40" w:type="dxa"/>
+              <w:right w:w="40" w:type="dxa"/>
             </w:tcMar>
           </w:tcPr>
           <w:p>
+            <w:pPr>
+              <w:jc w:val="center"/>
+            </w:pPr>
             <w:r>
               <w:rPr>
                 <w:rFonts w:ascii="Calibri" w:hAnsi="Calibri"/>
                 <w:b/>
                 <w:color w:val="16A34A"/>
-                <w:sz w:val="18"/>
+                <w:sz w:val="16"/>
+              </w:rPr>
+              <w:t>PASS</w:t>
+            </w:r>
+          </w:p>
+        </w:tc>
+      </w:tr>
+      <w:tr>
+        <w:trPr>
+          <w:cantSplit/>
+        </w:trPr>
+        <w:tc>
+          <w:tcPr>
+            <w:tcW w:type="dxa" w:w="1080"/>
+            <w:shd w:fill="F8FAFC"/>
+            <w:tcMar>
+              <w:top w:w="30" w:type="dxa"/>
+              <w:bottom w:w="30" w:type="dxa"/>
+              <w:left w:w="40" w:type="dxa"/>
+              <w:right w:w="40" w:type="dxa"/>
+            </w:tcMar>
+          </w:tcPr>
+          <w:p>
+            <w:pPr>
+              <w:jc w:val="center"/>
+            </w:pPr>
+            <w:r>
+              <w:rPr>
+                <w:rFonts w:ascii="Calibri" w:hAnsi="Calibri"/>
+                <w:color w:val="1E293B"/>
+                <w:sz w:val="16"/>
+              </w:rPr>
+              <w:t>TC-11</w:t>
+            </w:r>
+          </w:p>
+        </w:tc>
+        <w:tc>
+          <w:tcPr>
+            <w:tcW w:type="dxa" w:w="1152"/>
+            <w:shd w:fill="F8FAFC"/>
+            <w:tcMar>
+              <w:top w:w="30" w:type="dxa"/>
+              <w:bottom w:w="30" w:type="dxa"/>
+              <w:left w:w="40" w:type="dxa"/>
+              <w:right w:w="40" w:type="dxa"/>
+            </w:tcMar>
+          </w:tcPr>
+          <w:p>
+            <w:pPr>
+              <w:jc w:val="center"/>
+            </w:pPr>
+            <w:r>
+              <w:rPr>
+                <w:rFonts w:ascii="Calibri" w:hAnsi="Calibri"/>
+                <w:color w:val="1E293B"/>
+                <w:sz w:val="16"/>
+              </w:rPr>
+              <w:t>Unauth</w:t>
+            </w:r>
+          </w:p>
+        </w:tc>
+        <w:tc>
+          <w:tcPr>
+            <w:tcW w:type="dxa" w:w="3744"/>
+            <w:shd w:fill="F8FAFC"/>
+            <w:tcMar>
+              <w:top w:w="30" w:type="dxa"/>
+              <w:bottom w:w="30" w:type="dxa"/>
+              <w:left w:w="40" w:type="dxa"/>
+              <w:right w:w="40" w:type="dxa"/>
+            </w:tcMar>
+          </w:tcPr>
+          <w:p>
+            <w:pPr>
+              <w:jc w:val="left"/>
+            </w:pPr>
+            <w:r>
+              <w:rPr>
+                <w:rFonts w:ascii="Calibri" w:hAnsi="Calibri"/>
+                <w:color w:val="1E293B"/>
+                <w:sz w:val="16"/>
+              </w:rPr>
+              <w:t>Non-authorized address attempts to issue certificate</w:t>
+            </w:r>
+          </w:p>
+        </w:tc>
+        <w:tc>
+          <w:tcPr>
+            <w:tcW w:type="dxa" w:w="3528"/>
+            <w:shd w:fill="F8FAFC"/>
+            <w:tcMar>
+              <w:top w:w="30" w:type="dxa"/>
+              <w:bottom w:w="30" w:type="dxa"/>
+              <w:left w:w="40" w:type="dxa"/>
+              <w:right w:w="40" w:type="dxa"/>
+            </w:tcMar>
+          </w:tcPr>
+          <w:p>
+            <w:pPr>
+              <w:jc w:val="left"/>
+            </w:pPr>
+            <w:r>
+              <w:rPr>
+                <w:rFonts w:ascii="Calibri" w:hAnsi="Calibri"/>
+                <w:color w:val="DC2626"/>
+                <w:sz w:val="16"/>
+              </w:rPr>
+              <w:t>EVM Revert: 'Caller is not authorized to issue certificates'</w:t>
+            </w:r>
+          </w:p>
+        </w:tc>
+        <w:tc>
+          <w:tcPr>
+            <w:tcW w:type="dxa" w:w="864"/>
+            <w:shd w:fill="F8FAFC"/>
+            <w:tcMar>
+              <w:top w:w="30" w:type="dxa"/>
+              <w:bottom w:w="30" w:type="dxa"/>
+              <w:left w:w="40" w:type="dxa"/>
+              <w:right w:w="40" w:type="dxa"/>
+            </w:tcMar>
+          </w:tcPr>
+          <w:p>
+            <w:pPr>
+              <w:jc w:val="center"/>
+            </w:pPr>
+            <w:r>
+              <w:rPr>
+                <w:rFonts w:ascii="Calibri" w:hAnsi="Calibri"/>
+                <w:b/>
+                <w:color w:val="16A34A"/>
+                <w:sz w:val="16"/>
+              </w:rPr>
+              <w:t>PASS</w:t>
+            </w:r>
+          </w:p>
+        </w:tc>
+      </w:tr>
+      <w:tr>
+        <w:trPr>
+          <w:cantSplit/>
+        </w:trPr>
+        <w:tc>
+          <w:tcPr>
+            <w:tcW w:type="dxa" w:w="1080"/>
+            <w:shd w:fill="FFFFFF"/>
+            <w:tcMar>
+              <w:top w:w="30" w:type="dxa"/>
+              <w:bottom w:w="30" w:type="dxa"/>
+              <w:left w:w="40" w:type="dxa"/>
+              <w:right w:w="40" w:type="dxa"/>
+            </w:tcMar>
+          </w:tcPr>
+          <w:p>
+            <w:pPr>
+              <w:jc w:val="center"/>
+            </w:pPr>
+            <w:r>
+              <w:rPr>
+                <w:rFonts w:ascii="Calibri" w:hAnsi="Calibri"/>
+                <w:color w:val="1E293B"/>
+                <w:sz w:val="16"/>
+              </w:rPr>
+              <w:t>TC-12</w:t>
+            </w:r>
+          </w:p>
+        </w:tc>
+        <w:tc>
+          <w:tcPr>
+            <w:tcW w:type="dxa" w:w="1152"/>
+            <w:shd w:fill="FFFFFF"/>
+            <w:tcMar>
+              <w:top w:w="30" w:type="dxa"/>
+              <w:bottom w:w="30" w:type="dxa"/>
+              <w:left w:w="40" w:type="dxa"/>
+              <w:right w:w="40" w:type="dxa"/>
+            </w:tcMar>
+          </w:tcPr>
+          <w:p>
+            <w:pPr>
+              <w:jc w:val="center"/>
+            </w:pPr>
+            <w:r>
+              <w:rPr>
+                <w:rFonts w:ascii="Calibri" w:hAnsi="Calibri"/>
+                <w:color w:val="1E293B"/>
+                <w:sz w:val="16"/>
+              </w:rPr>
+              <w:t>Unauth</w:t>
+            </w:r>
+          </w:p>
+        </w:tc>
+        <w:tc>
+          <w:tcPr>
+            <w:tcW w:type="dxa" w:w="3744"/>
+            <w:shd w:fill="FFFFFF"/>
+            <w:tcMar>
+              <w:top w:w="30" w:type="dxa"/>
+              <w:bottom w:w="30" w:type="dxa"/>
+              <w:left w:w="40" w:type="dxa"/>
+              <w:right w:w="40" w:type="dxa"/>
+            </w:tcMar>
+          </w:tcPr>
+          <w:p>
+            <w:pPr>
+              <w:jc w:val="left"/>
+            </w:pPr>
+            <w:r>
+              <w:rPr>
+                <w:rFonts w:ascii="Calibri" w:hAnsi="Calibri"/>
+                <w:color w:val="1E293B"/>
+                <w:sz w:val="16"/>
+              </w:rPr>
+              <w:t>Unauthorized account attempts to revoke certificate</w:t>
+            </w:r>
+          </w:p>
+        </w:tc>
+        <w:tc>
+          <w:tcPr>
+            <w:tcW w:type="dxa" w:w="3528"/>
+            <w:shd w:fill="FFFFFF"/>
+            <w:tcMar>
+              <w:top w:w="30" w:type="dxa"/>
+              <w:bottom w:w="30" w:type="dxa"/>
+              <w:left w:w="40" w:type="dxa"/>
+              <w:right w:w="40" w:type="dxa"/>
+            </w:tcMar>
+          </w:tcPr>
+          <w:p>
+            <w:pPr>
+              <w:jc w:val="left"/>
+            </w:pPr>
+            <w:r>
+              <w:rPr>
+                <w:rFonts w:ascii="Calibri" w:hAnsi="Calibri"/>
+                <w:color w:val="DC2626"/>
+                <w:sz w:val="16"/>
+              </w:rPr>
+              <w:t>EVM Revert: 'Only issuing authority or owner can revoke'</w:t>
+            </w:r>
+          </w:p>
+        </w:tc>
+        <w:tc>
+          <w:tcPr>
+            <w:tcW w:type="dxa" w:w="864"/>
+            <w:shd w:fill="FFFFFF"/>
+            <w:tcMar>
+              <w:top w:w="30" w:type="dxa"/>
+              <w:bottom w:w="30" w:type="dxa"/>
+              <w:left w:w="40" w:type="dxa"/>
+              <w:right w:w="40" w:type="dxa"/>
+            </w:tcMar>
+          </w:tcPr>
+          <w:p>
+            <w:pPr>
+              <w:jc w:val="center"/>
+            </w:pPr>
+            <w:r>
+              <w:rPr>
+                <w:rFonts w:ascii="Calibri" w:hAnsi="Calibri"/>
+                <w:b/>
+                <w:color w:val="16A34A"/>
+                <w:sz w:val="16"/>
               </w:rPr>
               <w:t>PASS</w:t>
             </w:r>
@@ -1166,6 +2099,20 @@
       </w:tr>
     </w:tbl>
     <w:p>
+      <w:pPr>
+        <w:spacing w:before="120"/>
+      </w:pPr>
+      <w:r>
+        <w:rPr>
+          <w:rFonts w:ascii="Calibri" w:hAnsi="Calibri"/>
+          <w:b/>
+          <w:color w:val="16A34A"/>
+          <w:sz w:val="18"/>
+        </w:rPr>
+        <w:t>Automated EVM Test Suite Result: 12 / 12 Tests Passed (100% Success Rate) against live contract bytecode.</w:t>
+      </w:r>
+    </w:p>
+    <w:p>
       <w:r>
         <w:br w:type="page"/>
       </w:r>
@@ -1173,30 +2120,38 @@
     <w:p>
       <w:pPr>
         <w:pStyle w:val="Heading2"/>
+        <w:keepNext/>
+        <w:spacing w:before="40" w:after="40"/>
       </w:pPr>
       <w:r>
-        <w:t>4. Visual Evidence &amp; Execution Screenshots</w:t>
+        <w:t>4. Visual Evidence &amp; Blockchain Execution Captures</w:t>
       </w:r>
     </w:p>
     <w:p>
+      <w:pPr>
+        <w:keepNext/>
+        <w:spacing w:before="160" w:after="60"/>
+      </w:pPr>
       <w:r>
         <w:rPr>
           <w:rFonts w:ascii="Calibri" w:hAnsi="Calibri"/>
           <w:b/>
           <w:color w:val="1E293B"/>
-          <w:sz w:val="20"/>
+          <w:sz w:val="19"/>
         </w:rPr>
         <w:t>Figure 1: Smart Contract Compilation in Remix IDE (Solidity v0.8.20)</w:t>
       </w:r>
     </w:p>
     <w:p>
       <w:pPr>
+        <w:keepNext/>
+        <w:spacing w:after="120"/>
         <w:jc w:val="center"/>
       </w:pPr>
       <w:r>
         <w:drawing>
           <wp:inline xmlns:a="http://schemas.openxmlformats.org/drawingml/2006/main" xmlns:pic="http://schemas.openxmlformats.org/drawingml/2006/picture">
-            <wp:extent cx="5669280" cy="3569239"/>
+            <wp:extent cx="5303520" cy="3338966"/>
             <wp:docPr id="1" name="Picture 1"/>
             <wp:cNvGraphicFramePr>
               <a:graphicFrameLocks noChangeAspect="1"/>
@@ -1217,7 +2172,7 @@
                   <pic:spPr>
                     <a:xfrm>
                       <a:off x="0" y="0"/>
-                      <a:ext cx="5669280" cy="3569239"/>
+                      <a:ext cx="5303520" cy="3338966"/>
                     </a:xfrm>
                     <a:prstGeom prst="rect"/>
                   </pic:spPr>
@@ -1228,26 +2183,31 @@
         </w:drawing>
       </w:r>
     </w:p>
-    <w:p/>
     <w:p>
+      <w:pPr>
+        <w:keepNext/>
+        <w:spacing w:before="160" w:after="60"/>
+      </w:pPr>
       <w:r>
         <w:rPr>
           <w:rFonts w:ascii="Calibri" w:hAnsi="Calibri"/>
           <w:b/>
           <w:color w:val="1E293B"/>
-          <w:sz w:val="20"/>
+          <w:sz w:val="19"/>
         </w:rPr>
         <w:t>Figure 2: Smart Contract Deployment on Ganache Local Network</w:t>
       </w:r>
     </w:p>
     <w:p>
       <w:pPr>
+        <w:keepNext/>
+        <w:spacing w:after="120"/>
         <w:jc w:val="center"/>
       </w:pPr>
       <w:r>
         <w:drawing>
           <wp:inline xmlns:a="http://schemas.openxmlformats.org/drawingml/2006/main" xmlns:pic="http://schemas.openxmlformats.org/drawingml/2006/picture">
-            <wp:extent cx="5669280" cy="3569239"/>
+            <wp:extent cx="5303520" cy="3338966"/>
             <wp:docPr id="2" name="Picture 2"/>
             <wp:cNvGraphicFramePr>
               <a:graphicFrameLocks noChangeAspect="1"/>
@@ -1268,7 +2228,7 @@
                   <pic:spPr>
                     <a:xfrm>
                       <a:off x="0" y="0"/>
-                      <a:ext cx="5669280" cy="3569239"/>
+                      <a:ext cx="5303520" cy="3338966"/>
                     </a:xfrm>
                     <a:prstGeom prst="rect"/>
                   </pic:spPr>
@@ -1279,26 +2239,36 @@
         </w:drawing>
       </w:r>
     </w:p>
-    <w:p/>
     <w:p>
+      <w:r>
+        <w:br w:type="page"/>
+      </w:r>
+    </w:p>
+    <w:p>
+      <w:pPr>
+        <w:keepNext/>
+        <w:spacing w:before="160" w:after="60"/>
+      </w:pPr>
       <w:r>
         <w:rPr>
           <w:rFonts w:ascii="Calibri" w:hAnsi="Calibri"/>
           <w:b/>
           <w:color w:val="1E293B"/>
-          <w:sz w:val="20"/>
+          <w:sz w:val="19"/>
         </w:rPr>
-        <w:t>Figure 3: MetaMask Wallet Connection &amp; User Role Detection</w:t>
+        <w:t>Figure 3: MetaMask Wallet Connection &amp; Active Role Detection in EduVerify UI</w:t>
       </w:r>
     </w:p>
     <w:p>
       <w:pPr>
+        <w:keepNext/>
+        <w:spacing w:after="120"/>
         <w:jc w:val="center"/>
       </w:pPr>
       <w:r>
         <w:drawing>
           <wp:inline xmlns:a="http://schemas.openxmlformats.org/drawingml/2006/main" xmlns:pic="http://schemas.openxmlformats.org/drawingml/2006/picture">
-            <wp:extent cx="5669280" cy="3569239"/>
+            <wp:extent cx="5303520" cy="3338966"/>
             <wp:docPr id="3" name="Picture 3"/>
             <wp:cNvGraphicFramePr>
               <a:graphicFrameLocks noChangeAspect="1"/>
@@ -1319,7 +2289,7 @@
                   <pic:spPr>
                     <a:xfrm>
                       <a:off x="0" y="0"/>
-                      <a:ext cx="5669280" cy="3569239"/>
+                      <a:ext cx="5303520" cy="3338966"/>
                     </a:xfrm>
                     <a:prstGeom prst="rect"/>
                   </pic:spPr>
@@ -1330,26 +2300,31 @@
         </w:drawing>
       </w:r>
     </w:p>
-    <w:p/>
     <w:p>
+      <w:pPr>
+        <w:keepNext/>
+        <w:spacing w:before="160" w:after="60"/>
+      </w:pPr>
       <w:r>
         <w:rPr>
           <w:rFonts w:ascii="Calibri" w:hAnsi="Calibri"/>
           <w:b/>
           <w:color w:val="1E293B"/>
-          <w:sz w:val="20"/>
+          <w:sz w:val="19"/>
         </w:rPr>
-        <w:t>Figure 4: Successful Credential Issuance Transaction Execution</w:t>
+        <w:t>Figure 4: Successful Credential Issuance Transaction Execution on Blockchain</w:t>
       </w:r>
     </w:p>
     <w:p>
       <w:pPr>
+        <w:keepNext/>
+        <w:spacing w:after="120"/>
         <w:jc w:val="center"/>
       </w:pPr>
       <w:r>
         <w:drawing>
           <wp:inline xmlns:a="http://schemas.openxmlformats.org/drawingml/2006/main" xmlns:pic="http://schemas.openxmlformats.org/drawingml/2006/picture">
-            <wp:extent cx="5669280" cy="3569239"/>
+            <wp:extent cx="5303520" cy="3338966"/>
             <wp:docPr id="4" name="Picture 4"/>
             <wp:cNvGraphicFramePr>
               <a:graphicFrameLocks noChangeAspect="1"/>
@@ -1370,7 +2345,7 @@
                   <pic:spPr>
                     <a:xfrm>
                       <a:off x="0" y="0"/>
-                      <a:ext cx="5669280" cy="3569239"/>
+                      <a:ext cx="5303520" cy="3338966"/>
                     </a:xfrm>
                     <a:prstGeom prst="rect"/>
                   </pic:spPr>
@@ -1381,26 +2356,36 @@
         </w:drawing>
       </w:r>
     </w:p>
-    <w:p/>
     <w:p>
+      <w:r>
+        <w:br w:type="page"/>
+      </w:r>
+    </w:p>
+    <w:p>
+      <w:pPr>
+        <w:keepNext/>
+        <w:spacing w:before="160" w:after="60"/>
+      </w:pPr>
       <w:r>
         <w:rPr>
           <w:rFonts w:ascii="Calibri" w:hAnsi="Calibri"/>
           <w:b/>
           <w:color w:val="1E293B"/>
-          <w:sz w:val="20"/>
+          <w:sz w:val="19"/>
         </w:rPr>
-        <w:t>Figure 5: Transaction Revert Handling (Invalid Input &amp; Unauthorised Call)</w:t>
+        <w:t>Figure 5: Transaction Revert Handling (Solidity require Validation &amp; Unauthorized Call)</w:t>
       </w:r>
     </w:p>
     <w:p>
       <w:pPr>
+        <w:keepNext/>
+        <w:spacing w:after="120"/>
         <w:jc w:val="center"/>
       </w:pPr>
       <w:r>
         <w:drawing>
           <wp:inline xmlns:a="http://schemas.openxmlformats.org/drawingml/2006/main" xmlns:pic="http://schemas.openxmlformats.org/drawingml/2006/picture">
-            <wp:extent cx="5669280" cy="3569239"/>
+            <wp:extent cx="5303520" cy="3338966"/>
             <wp:docPr id="5" name="Picture 5"/>
             <wp:cNvGraphicFramePr>
               <a:graphicFrameLocks noChangeAspect="1"/>
@@ -1421,7 +2406,7 @@
                   <pic:spPr>
                     <a:xfrm>
                       <a:off x="0" y="0"/>
-                      <a:ext cx="5669280" cy="3569239"/>
+                      <a:ext cx="5303520" cy="3338966"/>
                     </a:xfrm>
                     <a:prstGeom prst="rect"/>
                   </pic:spPr>
@@ -1432,26 +2417,31 @@
         </w:drawing>
       </w:r>
     </w:p>
-    <w:p/>
     <w:p>
+      <w:pPr>
+        <w:keepNext/>
+        <w:spacing w:before="160" w:after="60"/>
+      </w:pPr>
       <w:r>
         <w:rPr>
           <w:rFonts w:ascii="Calibri" w:hAnsi="Calibri"/>
           <w:b/>
           <w:color w:val="1E293B"/>
-          <w:sz w:val="20"/>
+          <w:sz w:val="19"/>
         </w:rPr>
-        <w:t>Figure 6: Blockchain Data Query &amp; Certificate Verification Interface</w:t>
+        <w:t>Figure 6: Verified Blockchain Credential Retrieval &amp; Display Interface</w:t>
       </w:r>
     </w:p>
     <w:p>
       <w:pPr>
+        <w:keepNext/>
+        <w:spacing w:after="120"/>
         <w:jc w:val="center"/>
       </w:pPr>
       <w:r>
         <w:drawing>
           <wp:inline xmlns:a="http://schemas.openxmlformats.org/drawingml/2006/main" xmlns:pic="http://schemas.openxmlformats.org/drawingml/2006/picture">
-            <wp:extent cx="5669280" cy="3569239"/>
+            <wp:extent cx="5303520" cy="3338966"/>
             <wp:docPr id="6" name="Picture 6"/>
             <wp:cNvGraphicFramePr>
               <a:graphicFrameLocks noChangeAspect="1"/>
@@ -1472,7 +2462,7 @@
                   <pic:spPr>
                     <a:xfrm>
                       <a:off x="0" y="0"/>
-                      <a:ext cx="5669280" cy="3569239"/>
+                      <a:ext cx="5303520" cy="3338966"/>
                     </a:xfrm>
                     <a:prstGeom prst="rect"/>
                   </pic:spPr>
@@ -1483,7 +2473,6 @@
         </w:drawing>
       </w:r>
     </w:p>
-    <w:p/>
     <w:sectPr>
       <w:pgSz w:w="12240" w:h="15840"/>
       <w:pgMar w:top="936" w:right="936" w:bottom="936" w:left="936" w:header="720" w:footer="720" w:gutter="0"/>
@@ -1859,7 +2848,7 @@
     <w:rsid w:val="00FC693F"/>
     <w:rPr>
       <w:rFonts w:ascii="Calibri" w:hAnsi="Calibri"/>
-      <w:sz w:val="20"/>
+      <w:sz w:val="19"/>
     </w:rPr>
   </w:style>
   <w:style w:type="paragraph" w:styleId="Header">

</xml_diff>

<commit_message>
Update execution evidence screenshots from live Remix and EVM runs and align documentation
</commit_message>
<xml_diff>
--- a/SohamPawar_230905312_BT_Assignment2.docx
+++ b/SohamPawar_230905312_BT_Assignment2.docx
@@ -731,7 +731,7 @@
                 <w:color w:val="1E293B"/>
                 <w:sz w:val="16"/>
               </w:rPr>
-              <w:t>Owner authorizes CSE Department (0xDa16...)</w:t>
+              <w:t>Owner authorizes CSE Department (0xFFcf...)</w:t>
             </w:r>
           </w:p>
         </w:tc>
@@ -756,7 +756,7 @@
                 <w:color w:val="2563EB"/>
                 <w:sz w:val="16"/>
               </w:rPr>
-              <w:t>Tx: 0x3eec0512... | Gas: 139,874 gas</w:t>
+              <w:t>Tx: 0x27f619e7... | Gas: 139,874 gas</w:t>
             </w:r>
           </w:p>
         </w:tc>
@@ -887,7 +887,7 @@
                 <w:color w:val="2563EB"/>
                 <w:sz w:val="16"/>
               </w:rPr>
-              <w:t>Tx: 0x5edfccba... | Gas: 280,516 gas</w:t>
+              <w:t>Tx: 0xe97d1582... | Gas: 280,516 gas (Block #3)</w:t>
             </w:r>
           </w:p>
         </w:tc>
@@ -1149,7 +1149,7 @@
                 <w:color w:val="2563EB"/>
                 <w:sz w:val="16"/>
               </w:rPr>
-              <w:t>Tx: 0x3160e362... | isRevoked set to true</w:t>
+              <w:t>Tx: 0xdea52b0b... | isRevoked set to true</w:t>
             </w:r>
           </w:p>
         </w:tc>
@@ -2151,7 +2151,7 @@
       <w:r>
         <w:drawing>
           <wp:inline xmlns:a="http://schemas.openxmlformats.org/drawingml/2006/main" xmlns:pic="http://schemas.openxmlformats.org/drawingml/2006/picture">
-            <wp:extent cx="5303520" cy="3338966"/>
+            <wp:extent cx="5303520" cy="3314700"/>
             <wp:docPr id="1" name="Picture 1"/>
             <wp:cNvGraphicFramePr>
               <a:graphicFrameLocks noChangeAspect="1"/>
@@ -2172,7 +2172,7 @@
                   <pic:spPr>
                     <a:xfrm>
                       <a:off x="0" y="0"/>
-                      <a:ext cx="5303520" cy="3338966"/>
+                      <a:ext cx="5303520" cy="3314700"/>
                     </a:xfrm>
                     <a:prstGeom prst="rect"/>
                   </pic:spPr>
@@ -2195,7 +2195,7 @@
           <w:color w:val="1E293B"/>
           <w:sz w:val="19"/>
         </w:rPr>
-        <w:t>Figure 2: Smart Contract Deployment on Ganache Local Network</w:t>
+        <w:t>Figure 2: Smart Contract Deployment in Remix IDE Environment (Block #1)</w:t>
       </w:r>
     </w:p>
     <w:p>
@@ -2207,7 +2207,7 @@
       <w:r>
         <w:drawing>
           <wp:inline xmlns:a="http://schemas.openxmlformats.org/drawingml/2006/main" xmlns:pic="http://schemas.openxmlformats.org/drawingml/2006/picture">
-            <wp:extent cx="5303520" cy="3338966"/>
+            <wp:extent cx="5303520" cy="3314700"/>
             <wp:docPr id="2" name="Picture 2"/>
             <wp:cNvGraphicFramePr>
               <a:graphicFrameLocks noChangeAspect="1"/>
@@ -2228,7 +2228,7 @@
                   <pic:spPr>
                     <a:xfrm>
                       <a:off x="0" y="0"/>
-                      <a:ext cx="5303520" cy="3338966"/>
+                      <a:ext cx="5303520" cy="3314700"/>
                     </a:xfrm>
                     <a:prstGeom prst="rect"/>
                   </pic:spPr>
@@ -2268,7 +2268,7 @@
       <w:r>
         <w:drawing>
           <wp:inline xmlns:a="http://schemas.openxmlformats.org/drawingml/2006/main" xmlns:pic="http://schemas.openxmlformats.org/drawingml/2006/picture">
-            <wp:extent cx="5303520" cy="3338966"/>
+            <wp:extent cx="5303520" cy="3480435"/>
             <wp:docPr id="3" name="Picture 3"/>
             <wp:cNvGraphicFramePr>
               <a:graphicFrameLocks noChangeAspect="1"/>
@@ -2289,7 +2289,7 @@
                   <pic:spPr>
                     <a:xfrm>
                       <a:off x="0" y="0"/>
-                      <a:ext cx="5303520" cy="3338966"/>
+                      <a:ext cx="5303520" cy="3480435"/>
                     </a:xfrm>
                     <a:prstGeom prst="rect"/>
                   </pic:spPr>
@@ -2312,7 +2312,7 @@
           <w:color w:val="1E293B"/>
           <w:sz w:val="19"/>
         </w:rPr>
-        <w:t>Figure 4: Successful Credential Issuance Transaction Execution on Blockchain</w:t>
+        <w:t>Figure 4: Successful Credential Issuance Transaction Execution on Blockchain (Block #3)</w:t>
       </w:r>
     </w:p>
     <w:p>
@@ -2324,7 +2324,7 @@
       <w:r>
         <w:drawing>
           <wp:inline xmlns:a="http://schemas.openxmlformats.org/drawingml/2006/main" xmlns:pic="http://schemas.openxmlformats.org/drawingml/2006/picture">
-            <wp:extent cx="5303520" cy="3338966"/>
+            <wp:extent cx="5303520" cy="3480435"/>
             <wp:docPr id="4" name="Picture 4"/>
             <wp:cNvGraphicFramePr>
               <a:graphicFrameLocks noChangeAspect="1"/>
@@ -2345,7 +2345,7 @@
                   <pic:spPr>
                     <a:xfrm>
                       <a:off x="0" y="0"/>
-                      <a:ext cx="5303520" cy="3338966"/>
+                      <a:ext cx="5303520" cy="3480435"/>
                     </a:xfrm>
                     <a:prstGeom prst="rect"/>
                   </pic:spPr>
@@ -2385,7 +2385,7 @@
       <w:r>
         <w:drawing>
           <wp:inline xmlns:a="http://schemas.openxmlformats.org/drawingml/2006/main" xmlns:pic="http://schemas.openxmlformats.org/drawingml/2006/picture">
-            <wp:extent cx="5303520" cy="3338966"/>
+            <wp:extent cx="5303520" cy="3480435"/>
             <wp:docPr id="5" name="Picture 5"/>
             <wp:cNvGraphicFramePr>
               <a:graphicFrameLocks noChangeAspect="1"/>
@@ -2406,7 +2406,7 @@
                   <pic:spPr>
                     <a:xfrm>
                       <a:off x="0" y="0"/>
-                      <a:ext cx="5303520" cy="3338966"/>
+                      <a:ext cx="5303520" cy="3480435"/>
                     </a:xfrm>
                     <a:prstGeom prst="rect"/>
                   </pic:spPr>
@@ -2441,7 +2441,7 @@
       <w:r>
         <w:drawing>
           <wp:inline xmlns:a="http://schemas.openxmlformats.org/drawingml/2006/main" xmlns:pic="http://schemas.openxmlformats.org/drawingml/2006/picture">
-            <wp:extent cx="5303520" cy="3338966"/>
+            <wp:extent cx="5303520" cy="3480435"/>
             <wp:docPr id="6" name="Picture 6"/>
             <wp:cNvGraphicFramePr>
               <a:graphicFrameLocks noChangeAspect="1"/>
@@ -2462,7 +2462,7 @@
                   <pic:spPr>
                     <a:xfrm>
                       <a:off x="0" y="0"/>
-                      <a:ext cx="5303520" cy="3338966"/>
+                      <a:ext cx="5303520" cy="3480435"/>
                     </a:xfrm>
                     <a:prstGeom prst="rect"/>
                   </pic:spPr>

</xml_diff>

<commit_message>
Capture genuine Remix compilation, deployment, and revert handling evidence, and remove test mnemonic
</commit_message>
<xml_diff>
--- a/SohamPawar_230905312_BT_Assignment2.docx
+++ b/SohamPawar_230905312_BT_Assignment2.docx
@@ -731,7 +731,7 @@
                 <w:color w:val="1E293B"/>
                 <w:sz w:val="16"/>
               </w:rPr>
-              <w:t>Owner authorizes CSE Department (0xFFcf...)</w:t>
+              <w:t>Owner authorizes CSE Department (0x6174...)</w:t>
             </w:r>
           </w:p>
         </w:tc>
@@ -756,7 +756,7 @@
                 <w:color w:val="2563EB"/>
                 <w:sz w:val="16"/>
               </w:rPr>
-              <w:t>Tx: 0x27f619e7... | Gas: 139,874 gas</w:t>
+              <w:t>Tx: 0x5ced633e... | Gas: 139,874 gas</w:t>
             </w:r>
           </w:p>
         </w:tc>
@@ -887,7 +887,7 @@
                 <w:color w:val="2563EB"/>
                 <w:sz w:val="16"/>
               </w:rPr>
-              <w:t>Tx: 0xe97d1582... | Gas: 280,516 gas (Block #3)</w:t>
+              <w:t>Tx: 0xdc044036... | Gas: 280,516 gas (Block #3)</w:t>
             </w:r>
           </w:p>
         </w:tc>
@@ -1149,7 +1149,7 @@
                 <w:color w:val="2563EB"/>
                 <w:sz w:val="16"/>
               </w:rPr>
-              <w:t>Tx: 0xdea52b0b... | isRevoked set to true</w:t>
+              <w:t>Tx: 0x2218a3da... | isRevoked set to true</w:t>
             </w:r>
           </w:p>
         </w:tc>
@@ -2373,7 +2373,7 @@
           <w:color w:val="1E293B"/>
           <w:sz w:val="19"/>
         </w:rPr>
-        <w:t>Figure 5: Transaction Revert Handling (Solidity require Validation &amp; Unauthorized Call)</w:t>
+        <w:t>Figure 5: Failed Transaction Handling (Solidity require Revert &amp; EVM Exception Display)</w:t>
       </w:r>
     </w:p>
     <w:p>

</xml_diff>